<commit_message>
feat: add core database operations, UI components, and file parsers for employee salary management
</commit_message>
<xml_diff>
--- a/templates/kgb-template.docx
+++ b/templates/kgb-template.docx
@@ -1,6 +1,6 @@
 
 <file path=word/document.xml><?xml version="1.0" encoding="utf-8"?>
-<w:document xmlns:wpc="http://schemas.microsoft.com/office/word/2010/wordprocessingCanvas" xmlns:cx="http://schemas.microsoft.com/office/drawing/2014/chartex" xmlns:cx1="http://schemas.microsoft.com/office/drawing/2015/9/8/chartex" xmlns:cx2="http://schemas.microsoft.com/office/drawing/2015/10/21/chartex" xmlns:cx3="http://schemas.microsoft.com/office/drawing/2016/5/9/chartex" xmlns:cx4="http://schemas.microsoft.com/office/drawing/2016/5/10/chartex" xmlns:cx5="http://schemas.microsoft.com/office/drawing/2016/5/11/chartex" xmlns:cx6="http://schemas.microsoft.com/office/drawing/2016/5/12/chartex" xmlns:cx7="http://schemas.microsoft.com/office/drawing/2016/5/13/chartex" xmlns:cx8="http://schemas.microsoft.com/office/drawing/2016/5/14/chartex" xmlns:mc="http://schemas.openxmlformats.org/markup-compatibility/2006" xmlns:aink="http://schemas.microsoft.com/office/drawing/2016/ink" xmlns:am3d="http://schemas.microsoft.com/office/drawing/2017/model3d" xmlns:o="urn:schemas-microsoft-com:office:office" xmlns:r="http://schemas.openxmlformats.org/officeDocument/2006/relationships" xmlns:m="http://schemas.openxmlformats.org/officeDocument/2006/math" xmlns:v="urn:schemas-microsoft-com:vml" xmlns:wp14="http://schemas.microsoft.com/office/word/2010/wordprocessingDrawing" xmlns:wp="http://schemas.openxmlformats.org/drawingml/2006/wordprocessingDrawing" xmlns:w10="urn:schemas-microsoft-com:office:word" xmlns:w="http://schemas.openxmlformats.org/wordprocessingml/2006/main" xmlns:w14="http://schemas.microsoft.com/office/word/2010/wordml" xmlns:w15="http://schemas.microsoft.com/office/word/2012/wordml" xmlns:w16cex="http://schemas.microsoft.com/office/word/2018/wordml/cex" xmlns:w16cid="http://schemas.microsoft.com/office/word/2016/wordml/cid" xmlns:w16="http://schemas.microsoft.com/office/word/2018/wordml" xmlns:w16sdtdh="http://schemas.microsoft.com/office/word/2020/wordml/sdtdatahash" xmlns:w16se="http://schemas.microsoft.com/office/word/2015/wordml/symex" xmlns:wpg="http://schemas.microsoft.com/office/word/2010/wordprocessingGroup" xmlns:wpi="http://schemas.microsoft.com/office/word/2010/wordprocessingInk" xmlns:wne="http://schemas.microsoft.com/office/word/2006/wordml" xmlns:wps="http://schemas.microsoft.com/office/word/2010/wordprocessingShape" mc:Ignorable="w14 w15 w16se w16cid w16 w16cex w16sdtdh wp14">
+<w:document xmlns:wpc="http://schemas.microsoft.com/office/word/2010/wordprocessingCanvas" xmlns:mc="http://schemas.openxmlformats.org/markup-compatibility/2006" xmlns:o="urn:schemas-microsoft-com:office:office" xmlns:r="http://schemas.openxmlformats.org/officeDocument/2006/relationships" xmlns:m="http://schemas.openxmlformats.org/officeDocument/2006/math" xmlns:v="urn:schemas-microsoft-com:vml" xmlns:wp14="http://schemas.microsoft.com/office/word/2010/wordprocessingDrawing" xmlns:wp="http://schemas.openxmlformats.org/drawingml/2006/wordprocessingDrawing" xmlns:w10="urn:schemas-microsoft-com:office:word" xmlns:w="http://schemas.openxmlformats.org/wordprocessingml/2006/main" xmlns:w14="http://schemas.microsoft.com/office/word/2010/wordml" xmlns:w15="http://schemas.microsoft.com/office/word/2012/wordml" xmlns:wpg="http://schemas.microsoft.com/office/word/2010/wordprocessingGroup" xmlns:wpi="http://schemas.microsoft.com/office/word/2010/wordprocessingInk" xmlns:wne="http://schemas.microsoft.com/office/word/2006/wordml" xmlns:wps="http://schemas.microsoft.com/office/word/2010/wordprocessingShape" mc:Ignorable="w14 w15 wp14">
   <w:body>
     <w:p>
       <w:pPr>
@@ -236,117 +236,7 @@
           <w:sz w:val="18"/>
           <w:lang w:val="en-ID"/>
         </w:rPr>
-        <w:t xml:space="preserve">Jl. </w:t>
-      </w:r>
-      <w:proofErr w:type="spellStart"/>
-      <w:r>
-        <w:rPr>
-          <w:rFonts w:ascii="Arial" w:eastAsia="Times New Roman" w:hAnsi="Arial" w:cs="Arial"/>
-          <w:spacing w:val="-10"/>
-          <w:kern w:val="28"/>
-          <w:sz w:val="18"/>
-          <w:lang w:val="en-ID"/>
-        </w:rPr>
-        <w:t>Jendral</w:t>
-      </w:r>
-      <w:proofErr w:type="spellEnd"/>
-      <w:r>
-        <w:rPr>
-          <w:rFonts w:ascii="Arial" w:eastAsia="Times New Roman" w:hAnsi="Arial" w:cs="Arial"/>
-          <w:spacing w:val="-10"/>
-          <w:kern w:val="28"/>
-          <w:sz w:val="18"/>
-          <w:lang w:val="en-ID"/>
-        </w:rPr>
-        <w:t xml:space="preserve"> Ahmad Yani KM5, Kel. </w:t>
-      </w:r>
-      <w:proofErr w:type="spellStart"/>
-      <w:r>
-        <w:rPr>
-          <w:rFonts w:ascii="Arial" w:eastAsia="Times New Roman" w:hAnsi="Arial" w:cs="Arial"/>
-          <w:spacing w:val="-10"/>
-          <w:kern w:val="28"/>
-          <w:sz w:val="18"/>
-          <w:lang w:val="en-ID"/>
-        </w:rPr>
-        <w:t>Kemelak</w:t>
-      </w:r>
-      <w:proofErr w:type="spellEnd"/>
-      <w:r>
-        <w:rPr>
-          <w:rFonts w:ascii="Arial" w:eastAsia="Times New Roman" w:hAnsi="Arial" w:cs="Arial"/>
-          <w:spacing w:val="-10"/>
-          <w:kern w:val="28"/>
-          <w:sz w:val="18"/>
-          <w:lang w:val="en-ID"/>
-        </w:rPr>
-        <w:t xml:space="preserve"> </w:t>
-      </w:r>
-      <w:proofErr w:type="spellStart"/>
-      <w:r>
-        <w:rPr>
-          <w:rFonts w:ascii="Arial" w:eastAsia="Times New Roman" w:hAnsi="Arial" w:cs="Arial"/>
-          <w:spacing w:val="-10"/>
-          <w:kern w:val="28"/>
-          <w:sz w:val="18"/>
-          <w:lang w:val="en-ID"/>
-        </w:rPr>
-        <w:t>Bindung</w:t>
-      </w:r>
-      <w:proofErr w:type="spellEnd"/>
-      <w:r>
-        <w:rPr>
-          <w:rFonts w:ascii="Arial" w:eastAsia="Times New Roman" w:hAnsi="Arial" w:cs="Arial"/>
-          <w:spacing w:val="-10"/>
-          <w:kern w:val="28"/>
-          <w:sz w:val="18"/>
-          <w:lang w:val="en-ID"/>
-        </w:rPr>
-        <w:t xml:space="preserve"> Langit, </w:t>
-      </w:r>
-      <w:proofErr w:type="spellStart"/>
-      <w:r>
-        <w:rPr>
-          <w:rFonts w:ascii="Arial" w:eastAsia="Times New Roman" w:hAnsi="Arial" w:cs="Arial"/>
-          <w:spacing w:val="-10"/>
-          <w:kern w:val="28"/>
-          <w:sz w:val="18"/>
-          <w:lang w:val="en-ID"/>
-        </w:rPr>
-        <w:t>Kab.Ogan</w:t>
-      </w:r>
-      <w:proofErr w:type="spellEnd"/>
-      <w:r>
-        <w:rPr>
-          <w:rFonts w:ascii="Arial" w:eastAsia="Times New Roman" w:hAnsi="Arial" w:cs="Arial"/>
-          <w:spacing w:val="-10"/>
-          <w:kern w:val="28"/>
-          <w:sz w:val="18"/>
-          <w:lang w:val="en-ID"/>
-        </w:rPr>
-        <w:t xml:space="preserve"> </w:t>
-      </w:r>
-      <w:proofErr w:type="spellStart"/>
-      <w:r>
-        <w:rPr>
-          <w:rFonts w:ascii="Arial" w:eastAsia="Times New Roman" w:hAnsi="Arial" w:cs="Arial"/>
-          <w:spacing w:val="-10"/>
-          <w:kern w:val="28"/>
-          <w:sz w:val="18"/>
-          <w:lang w:val="en-ID"/>
-        </w:rPr>
-        <w:t>Komering</w:t>
-      </w:r>
-      <w:proofErr w:type="spellEnd"/>
-      <w:r>
-        <w:rPr>
-          <w:rFonts w:ascii="Arial" w:eastAsia="Times New Roman" w:hAnsi="Arial" w:cs="Arial"/>
-          <w:spacing w:val="-10"/>
-          <w:kern w:val="28"/>
-          <w:sz w:val="18"/>
-          <w:lang w:val="en-ID"/>
-        </w:rPr>
-        <w:t xml:space="preserve"> Ulu</w:t>
+        <w:t>Jl. Jendral Ahmad Yani KM5, Kel. Kemelak Bindung Langit, Kab.Ogan Komering Ulu</w:t>
       </w:r>
       <w:r>
         <w:rPr>
@@ -382,6 +272,7 @@
       <w:r>
         <w:rPr>
           <w:noProof/>
+          <w:lang w:val="en-US"/>
         </w:rPr>
         <mc:AlternateContent>
           <mc:Choice Requires="wps">
@@ -438,7 +329,7 @@
               </wp:anchor>
             </w:drawing>
           </mc:Choice>
-          <mc:Fallback>
+          <mc:Fallback xmlns:w16se="http://schemas.microsoft.com/office/word/2015/wordml/symex" xmlns:w16sdtdh="http://schemas.microsoft.com/office/word/2020/wordml/sdtdatahash" xmlns:w16="http://schemas.microsoft.com/office/word/2018/wordml" xmlns:w16cid="http://schemas.microsoft.com/office/word/2016/wordml/cid" xmlns:w16cex="http://schemas.microsoft.com/office/word/2018/wordml/cex" xmlns:am3d="http://schemas.microsoft.com/office/drawing/2017/model3d" xmlns:aink="http://schemas.microsoft.com/office/drawing/2016/ink" xmlns:cx8="http://schemas.microsoft.com/office/drawing/2016/5/14/chartex" xmlns:cx7="http://schemas.microsoft.com/office/drawing/2016/5/13/chartex" xmlns:cx6="http://schemas.microsoft.com/office/drawing/2016/5/12/chartex" xmlns:cx5="http://schemas.microsoft.com/office/drawing/2016/5/11/chartex" xmlns:cx4="http://schemas.microsoft.com/office/drawing/2016/5/10/chartex" xmlns:cx3="http://schemas.microsoft.com/office/drawing/2016/5/9/chartex" xmlns:cx2="http://schemas.microsoft.com/office/drawing/2015/10/21/chartex" xmlns:cx1="http://schemas.microsoft.com/office/drawing/2015/9/8/chartex" xmlns:cx="http://schemas.microsoft.com/office/drawing/2014/chartex">
             <w:pict>
               <v:line w14:anchorId="0ACB3A0F" id="Straight Connector 47" o:spid="_x0000_s1026" style="position:absolute;z-index:251752448;visibility:visible;mso-wrap-style:square;mso-width-percent:0;mso-height-percent:0;mso-wrap-distance-left:9pt;mso-wrap-distance-top:-3e-5mm;mso-wrap-distance-right:9pt;mso-wrap-distance-bottom:-3e-5mm;mso-position-horizontal:absolute;mso-position-horizontal-relative:text;mso-position-vertical:absolute;mso-position-vertical-relative:text;mso-width-percent:0;mso-height-percent:0;mso-width-relative:margin;mso-height-relative:page" from="45.05pt,1.65pt" to="547.65pt,1.65pt" o:gfxdata="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" strokecolor="windowText" strokeweight="3.75pt">
                 <v:stroke linestyle="thinThick" joinstyle="miter"/>
@@ -558,21 +449,7 @@
               <w:rPr>
                 <w:lang w:val="en-US"/>
               </w:rPr>
-              <w:t>{</w:t>
-            </w:r>
-            <w:proofErr w:type="spellStart"/>
-            <w:r>
-              <w:rPr>
-                <w:lang w:val="en-US"/>
-              </w:rPr>
-              <w:t>tanggal_surat</w:t>
-            </w:r>
-            <w:proofErr w:type="spellEnd"/>
-            <w:r>
-              <w:rPr>
-                <w:lang w:val="en-US"/>
-              </w:rPr>
-              <w:t>}</w:t>
+              <w:t>{tanggal_surat}</w:t>
             </w:r>
           </w:p>
         </w:tc>
@@ -686,16 +563,8 @@
               <w:rPr>
                 <w:lang w:val="en-US"/>
               </w:rPr>
-              <w:t xml:space="preserve">KEPADA </w:t>
+              <w:t>KEPADA YTH :</w:t>
             </w:r>
-            <w:proofErr w:type="gramStart"/>
-            <w:r>
-              <w:rPr>
-                <w:lang w:val="en-US"/>
-              </w:rPr>
-              <w:t>YTH :</w:t>
-            </w:r>
-            <w:proofErr w:type="gramEnd"/>
           </w:p>
         </w:tc>
       </w:tr>
@@ -737,47 +606,11 @@
               </w:rPr>
               <w:t xml:space="preserve"> </w:t>
             </w:r>
-            <w:proofErr w:type="spellStart"/>
             <w:r>
               <w:rPr>
                 <w:lang w:val="en-US"/>
               </w:rPr>
-              <w:t>Kenaikan</w:t>
-            </w:r>
-            <w:proofErr w:type="spellEnd"/>
-            <w:r>
-              <w:rPr>
-                <w:lang w:val="en-US"/>
-              </w:rPr>
-              <w:t xml:space="preserve"> </w:t>
-            </w:r>
-            <w:proofErr w:type="spellStart"/>
-            <w:r>
-              <w:rPr>
-                <w:lang w:val="en-US"/>
-              </w:rPr>
-              <w:t>Gaji</w:t>
-            </w:r>
-            <w:proofErr w:type="spellEnd"/>
-            <w:r>
-              <w:rPr>
-                <w:lang w:val="en-US"/>
-              </w:rPr>
-              <w:t xml:space="preserve"> </w:t>
-            </w:r>
-            <w:proofErr w:type="spellStart"/>
-            <w:r>
-              <w:rPr>
-                <w:lang w:val="en-US"/>
-              </w:rPr>
-              <w:t>Berkala</w:t>
-            </w:r>
-            <w:proofErr w:type="spellEnd"/>
-            <w:r>
-              <w:rPr>
-                <w:lang w:val="en-US"/>
-              </w:rPr>
-              <w:t xml:space="preserve"> An.</w:t>
+              <w:t>Kenaikan Gaji Berkala An.</w:t>
             </w:r>
           </w:p>
         </w:tc>
@@ -828,69 +661,13 @@
               <w:rPr>
                 <w:lang w:val="en-US"/>
               </w:rPr>
-              <w:t>{</w:t>
-            </w:r>
-            <w:proofErr w:type="spellStart"/>
-            <w:r>
-              <w:rPr>
-                <w:lang w:val="en-US"/>
-              </w:rPr>
-              <w:t>nama</w:t>
-            </w:r>
-            <w:proofErr w:type="spellEnd"/>
-            <w:r>
-              <w:rPr>
-                <w:lang w:val="en-US"/>
-              </w:rPr>
-              <w:t>} {</w:t>
-            </w:r>
-            <w:proofErr w:type="spellStart"/>
-            <w:r>
-              <w:rPr>
-                <w:lang w:val="en-US"/>
-              </w:rPr>
-              <w:t>pangkat_golongan</w:t>
-            </w:r>
-            <w:proofErr w:type="spellEnd"/>
-            <w:r>
-              <w:rPr>
-                <w:lang w:val="en-US"/>
-              </w:rPr>
-              <w:t>}</w:t>
+              <w:t>{nama} {pangkat_golongan}</w:t>
             </w:r>
             <w:r>
               <w:rPr>
                 <w:lang w:val="en-US"/>
               </w:rPr>
-              <w:t xml:space="preserve"> NIP. {nip} pada </w:t>
-            </w:r>
-            <w:proofErr w:type="spellStart"/>
-            <w:r>
-              <w:rPr>
-                <w:lang w:val="en-US"/>
-              </w:rPr>
-              <w:t>Kejaksaan</w:t>
-            </w:r>
-            <w:proofErr w:type="spellEnd"/>
-            <w:r>
-              <w:rPr>
-                <w:lang w:val="en-US"/>
-              </w:rPr>
-              <w:t xml:space="preserve"> Negeri Ogan </w:t>
-            </w:r>
-            <w:proofErr w:type="spellStart"/>
-            <w:r>
-              <w:rPr>
-                <w:lang w:val="en-US"/>
-              </w:rPr>
-              <w:t>Komering</w:t>
-            </w:r>
-            <w:proofErr w:type="spellEnd"/>
-            <w:r>
-              <w:rPr>
-                <w:lang w:val="en-US"/>
-              </w:rPr>
-              <w:t xml:space="preserve"> Ulu</w:t>
+              <w:t xml:space="preserve"> NIP. {nip} pada Kejaksaan Negeri Ogan Komering Ulu</w:t>
             </w:r>
             <w:r>
               <w:rPr>
@@ -1024,175 +801,11 @@
           <w:lang w:val="en-US"/>
         </w:rPr>
       </w:pPr>
-      <w:proofErr w:type="spellStart"/>
-      <w:r>
-        <w:rPr>
-          <w:lang w:val="en-US"/>
-        </w:rPr>
-        <w:t>Dengan</w:t>
-      </w:r>
-      <w:proofErr w:type="spellEnd"/>
-      <w:r>
-        <w:rPr>
-          <w:lang w:val="en-US"/>
-        </w:rPr>
-        <w:t xml:space="preserve"> </w:t>
-      </w:r>
-      <w:proofErr w:type="spellStart"/>
-      <w:r>
-        <w:rPr>
-          <w:lang w:val="en-US"/>
-        </w:rPr>
-        <w:t>ini</w:t>
-      </w:r>
-      <w:proofErr w:type="spellEnd"/>
-      <w:r>
-        <w:rPr>
-          <w:lang w:val="en-US"/>
-        </w:rPr>
-        <w:t xml:space="preserve"> </w:t>
-      </w:r>
-      <w:proofErr w:type="spellStart"/>
-      <w:r>
-        <w:rPr>
-          <w:lang w:val="en-US"/>
-        </w:rPr>
-        <w:t>diberitahukan</w:t>
-      </w:r>
-      <w:proofErr w:type="spellEnd"/>
-      <w:r>
-        <w:rPr>
-          <w:lang w:val="en-US"/>
-        </w:rPr>
-        <w:t xml:space="preserve">, </w:t>
-      </w:r>
-      <w:proofErr w:type="spellStart"/>
-      <w:r>
-        <w:rPr>
-          <w:lang w:val="en-US"/>
-        </w:rPr>
-        <w:t>bahwa</w:t>
-      </w:r>
-      <w:proofErr w:type="spellEnd"/>
-      <w:r>
-        <w:rPr>
-          <w:lang w:val="en-US"/>
-        </w:rPr>
-        <w:t xml:space="preserve"> </w:t>
-      </w:r>
-      <w:proofErr w:type="spellStart"/>
-      <w:r>
-        <w:rPr>
-          <w:lang w:val="en-US"/>
-        </w:rPr>
-        <w:t>berhubung</w:t>
-      </w:r>
-      <w:proofErr w:type="spellEnd"/>
-      <w:r>
-        <w:rPr>
-          <w:lang w:val="en-US"/>
-        </w:rPr>
-        <w:t xml:space="preserve"> </w:t>
-      </w:r>
-      <w:proofErr w:type="spellStart"/>
-      <w:r>
-        <w:rPr>
-          <w:lang w:val="en-US"/>
-        </w:rPr>
-        <w:t>telah</w:t>
-      </w:r>
-      <w:proofErr w:type="spellEnd"/>
-      <w:r>
-        <w:rPr>
-          <w:lang w:val="en-US"/>
-        </w:rPr>
-        <w:t xml:space="preserve"> </w:t>
-      </w:r>
-      <w:proofErr w:type="spellStart"/>
-      <w:r>
-        <w:rPr>
-          <w:lang w:val="en-US"/>
-        </w:rPr>
-        <w:t>dipenuhinya</w:t>
-      </w:r>
-      <w:proofErr w:type="spellEnd"/>
-      <w:r>
-        <w:rPr>
-          <w:lang w:val="en-US"/>
-        </w:rPr>
-        <w:t xml:space="preserve"> masa </w:t>
-      </w:r>
-      <w:proofErr w:type="spellStart"/>
-      <w:r>
-        <w:rPr>
-          <w:lang w:val="en-US"/>
-        </w:rPr>
-        <w:t>kerja</w:t>
-      </w:r>
-      <w:proofErr w:type="spellEnd"/>
-      <w:r>
-        <w:rPr>
-          <w:lang w:val="en-US"/>
-        </w:rPr>
-        <w:t xml:space="preserve"> dan </w:t>
-      </w:r>
-      <w:proofErr w:type="spellStart"/>
-      <w:r>
-        <w:rPr>
-          <w:lang w:val="en-US"/>
-        </w:rPr>
-        <w:t>syarat</w:t>
-      </w:r>
-      <w:proofErr w:type="spellEnd"/>
-      <w:r>
-        <w:rPr>
-          <w:lang w:val="en-US"/>
-        </w:rPr>
-        <w:t xml:space="preserve"> – </w:t>
-      </w:r>
-      <w:proofErr w:type="spellStart"/>
-      <w:proofErr w:type="gramStart"/>
-      <w:r>
-        <w:rPr>
-          <w:lang w:val="en-US"/>
-        </w:rPr>
-        <w:t>syarat</w:t>
-      </w:r>
-      <w:proofErr w:type="spellEnd"/>
-      <w:r>
-        <w:rPr>
-          <w:lang w:val="en-US"/>
-        </w:rPr>
-        <w:t xml:space="preserve">  </w:t>
-      </w:r>
-      <w:proofErr w:type="spellStart"/>
-      <w:r>
-        <w:rPr>
-          <w:lang w:val="en-US"/>
-        </w:rPr>
-        <w:t>lainnya</w:t>
-      </w:r>
-      <w:proofErr w:type="spellEnd"/>
-      <w:proofErr w:type="gramEnd"/>
-      <w:r>
-        <w:rPr>
-          <w:lang w:val="en-US"/>
-        </w:rPr>
-        <w:t xml:space="preserve"> </w:t>
-      </w:r>
-      <w:proofErr w:type="spellStart"/>
-      <w:r>
-        <w:rPr>
-          <w:lang w:val="en-US"/>
-        </w:rPr>
-        <w:t>kenpada</w:t>
-      </w:r>
-      <w:proofErr w:type="spellEnd"/>
-      <w:r>
-        <w:rPr>
-          <w:lang w:val="en-US"/>
-        </w:rPr>
-        <w:t xml:space="preserve"> :</w:t>
+      <w:r>
+        <w:rPr>
+          <w:lang w:val="en-US"/>
+        </w:rPr>
+        <w:t>Dengan ini diberitahukan, bahwa berhubung telah dipenuhinya masa kerja dan syarat – syarat  lainnya kenpada :</w:t>
       </w:r>
     </w:p>
     <w:p>
@@ -1216,7 +829,6 @@
           <w:lang w:val="en-US"/>
         </w:rPr>
       </w:pPr>
-      <w:proofErr w:type="gramStart"/>
       <w:r>
         <w:rPr>
           <w:lang w:val="en-US"/>
@@ -1229,7 +841,6 @@
         </w:rPr>
         <w:tab/>
       </w:r>
-      <w:proofErr w:type="gramEnd"/>
       <w:r>
         <w:rPr>
           <w:lang w:val="en-US"/>
@@ -1253,21 +864,7 @@
         <w:rPr>
           <w:lang w:val="en-US"/>
         </w:rPr>
-        <w:t xml:space="preserve">  {</w:t>
-      </w:r>
-      <w:proofErr w:type="spellStart"/>
-      <w:r>
-        <w:rPr>
-          <w:lang w:val="en-US"/>
-        </w:rPr>
-        <w:t>nama</w:t>
-      </w:r>
-      <w:proofErr w:type="spellEnd"/>
-      <w:r>
-        <w:rPr>
-          <w:lang w:val="en-US"/>
-        </w:rPr>
-        <w:t>}</w:t>
+        <w:t xml:space="preserve">  {nama}</w:t>
       </w:r>
     </w:p>
     <w:p>
@@ -1319,7 +916,6 @@
         </w:rPr>
         <w:tab/>
       </w:r>
-      <w:proofErr w:type="gramStart"/>
       <w:r>
         <w:rPr>
           <w:lang w:val="en-US"/>
@@ -1330,14 +926,7 @@
         <w:rPr>
           <w:lang w:val="en-US"/>
         </w:rPr>
-        <w:t xml:space="preserve">  {</w:t>
-      </w:r>
-      <w:proofErr w:type="gramEnd"/>
-      <w:r>
-        <w:rPr>
-          <w:lang w:val="en-US"/>
-        </w:rPr>
-        <w:t>nip}</w:t>
+        <w:t xml:space="preserve">  {nip}</w:t>
       </w:r>
     </w:p>
     <w:p>
@@ -1353,47 +942,30 @@
           <w:lang w:val="en-US"/>
         </w:rPr>
       </w:pPr>
-      <w:proofErr w:type="spellStart"/>
-      <w:r>
-        <w:rPr>
-          <w:lang w:val="en-US"/>
-        </w:rPr>
-        <w:t>Pangkat</w:t>
-      </w:r>
-      <w:proofErr w:type="spellEnd"/>
-      <w:r>
-        <w:rPr>
-          <w:lang w:val="en-US"/>
-        </w:rPr>
-        <w:t xml:space="preserve"> / </w:t>
-      </w:r>
-      <w:proofErr w:type="spellStart"/>
-      <w:r>
-        <w:rPr>
-          <w:lang w:val="en-US"/>
-        </w:rPr>
-        <w:t>Golongan</w:t>
-      </w:r>
-      <w:proofErr w:type="spellEnd"/>
-      <w:r>
-        <w:rPr>
-          <w:lang w:val="en-US"/>
-        </w:rPr>
-        <w:tab/>
-      </w:r>
-      <w:r>
-        <w:rPr>
-          <w:lang w:val="en-US"/>
-        </w:rPr>
-        <w:tab/>
-      </w:r>
-      <w:r>
-        <w:rPr>
-          <w:lang w:val="en-US"/>
-        </w:rPr>
-        <w:tab/>
-      </w:r>
-      <w:proofErr w:type="gramStart"/>
+      <w:r>
+        <w:rPr>
+          <w:lang w:val="en-US"/>
+        </w:rPr>
+        <w:t>Pangkat / Golongan</w:t>
+      </w:r>
+      <w:r>
+        <w:rPr>
+          <w:lang w:val="en-US"/>
+        </w:rPr>
+        <w:tab/>
+      </w:r>
+      <w:r>
+        <w:rPr>
+          <w:lang w:val="en-US"/>
+        </w:rPr>
+        <w:tab/>
+      </w:r>
+      <w:r>
+        <w:rPr>
+          <w:lang w:val="en-US"/>
+        </w:rPr>
+        <w:tab/>
+      </w:r>
       <w:r>
         <w:rPr>
           <w:lang w:val="en-US"/>
@@ -1404,22 +976,7 @@
         <w:rPr>
           <w:lang w:val="en-US"/>
         </w:rPr>
-        <w:t xml:space="preserve">  {</w:t>
-      </w:r>
-      <w:proofErr w:type="spellStart"/>
-      <w:proofErr w:type="gramEnd"/>
-      <w:r>
-        <w:rPr>
-          <w:lang w:val="en-US"/>
-        </w:rPr>
-        <w:t>pangkat_golongan</w:t>
-      </w:r>
-      <w:proofErr w:type="spellEnd"/>
-      <w:r>
-        <w:rPr>
-          <w:lang w:val="en-US"/>
-        </w:rPr>
-        <w:t>}</w:t>
+        <w:t xml:space="preserve">  {pangkat_golongan}</w:t>
       </w:r>
     </w:p>
     <w:p>
@@ -1439,69 +996,26 @@
         <w:rPr>
           <w:lang w:val="en-US"/>
         </w:rPr>
-        <w:t xml:space="preserve">Kantor / </w:t>
-      </w:r>
-      <w:proofErr w:type="spellStart"/>
-      <w:r>
-        <w:rPr>
-          <w:lang w:val="en-US"/>
-        </w:rPr>
-        <w:t>Tempat</w:t>
-      </w:r>
-      <w:proofErr w:type="spellEnd"/>
-      <w:r>
-        <w:rPr>
-          <w:lang w:val="en-US"/>
-        </w:rPr>
-        <w:t xml:space="preserve"> </w:t>
-      </w:r>
-      <w:proofErr w:type="spellStart"/>
-      <w:r>
-        <w:rPr>
-          <w:lang w:val="en-US"/>
-        </w:rPr>
-        <w:t>Kerja</w:t>
-      </w:r>
-      <w:proofErr w:type="spellEnd"/>
-      <w:r>
-        <w:rPr>
-          <w:lang w:val="en-US"/>
-        </w:rPr>
-        <w:tab/>
-      </w:r>
-      <w:r>
-        <w:rPr>
-          <w:lang w:val="en-US"/>
-        </w:rPr>
-        <w:tab/>
-      </w:r>
-      <w:proofErr w:type="gramStart"/>
-      <w:r>
-        <w:rPr>
-          <w:lang w:val="en-US"/>
-        </w:rPr>
+        <w:t>Kantor / Tempat Kerja</w:t>
+      </w:r>
+      <w:r>
+        <w:rPr>
+          <w:lang w:val="en-US"/>
+        </w:rPr>
+        <w:tab/>
+      </w:r>
+      <w:r>
+        <w:rPr>
+          <w:lang w:val="en-US"/>
+        </w:rPr>
+        <w:tab/>
         <w:t>:</w:t>
       </w:r>
       <w:r>
         <w:rPr>
           <w:lang w:val="en-US"/>
         </w:rPr>
-        <w:t xml:space="preserve">  {</w:t>
-      </w:r>
-      <w:proofErr w:type="spellStart"/>
-      <w:proofErr w:type="gramEnd"/>
-      <w:r>
-        <w:rPr>
-          <w:lang w:val="en-US"/>
-        </w:rPr>
-        <w:t>satuan_kerja</w:t>
-      </w:r>
-      <w:proofErr w:type="spellEnd"/>
-      <w:r>
-        <w:rPr>
-          <w:lang w:val="en-US"/>
-        </w:rPr>
-        <w:t>}</w:t>
+        <w:t xml:space="preserve">  {satuan_kerja}</w:t>
       </w:r>
     </w:p>
     <w:p>
@@ -1517,79 +1031,36 @@
           <w:lang w:val="en-US"/>
         </w:rPr>
       </w:pPr>
-      <w:proofErr w:type="spellStart"/>
-      <w:r>
-        <w:rPr>
-          <w:lang w:val="en-US"/>
-        </w:rPr>
-        <w:t>Gaji</w:t>
-      </w:r>
-      <w:proofErr w:type="spellEnd"/>
-      <w:r>
-        <w:rPr>
-          <w:lang w:val="en-US"/>
-        </w:rPr>
-        <w:t xml:space="preserve"> </w:t>
-      </w:r>
-      <w:proofErr w:type="spellStart"/>
-      <w:r>
-        <w:rPr>
-          <w:lang w:val="en-US"/>
-        </w:rPr>
-        <w:t>pokok</w:t>
-      </w:r>
-      <w:proofErr w:type="spellEnd"/>
-      <w:r>
-        <w:rPr>
-          <w:lang w:val="en-US"/>
-        </w:rPr>
-        <w:t xml:space="preserve"> lama </w:t>
-      </w:r>
-      <w:r>
-        <w:rPr>
-          <w:lang w:val="en-US"/>
-        </w:rPr>
-        <w:tab/>
-      </w:r>
-      <w:r>
-        <w:rPr>
-          <w:lang w:val="en-US"/>
-        </w:rPr>
-        <w:tab/>
-      </w:r>
-      <w:r>
-        <w:rPr>
-          <w:lang w:val="en-US"/>
-        </w:rPr>
-        <w:tab/>
-      </w:r>
-      <w:proofErr w:type="gramStart"/>
-      <w:r>
-        <w:rPr>
-          <w:lang w:val="en-US"/>
-        </w:rPr>
+      <w:r>
+        <w:rPr>
+          <w:lang w:val="en-US"/>
+        </w:rPr>
+        <w:t xml:space="preserve">Gaji pokok lama </w:t>
+      </w:r>
+      <w:r>
+        <w:rPr>
+          <w:lang w:val="en-US"/>
+        </w:rPr>
+        <w:tab/>
+      </w:r>
+      <w:r>
+        <w:rPr>
+          <w:lang w:val="en-US"/>
+        </w:rPr>
+        <w:tab/>
+      </w:r>
+      <w:r>
+        <w:rPr>
+          <w:lang w:val="en-US"/>
+        </w:rPr>
+        <w:tab/>
         <w:t>:</w:t>
       </w:r>
       <w:r>
         <w:rPr>
           <w:lang w:val="en-US"/>
         </w:rPr>
-        <w:t xml:space="preserve">  {</w:t>
-      </w:r>
-      <w:proofErr w:type="spellStart"/>
-      <w:proofErr w:type="gramEnd"/>
-      <w:r>
-        <w:rPr>
-          <w:lang w:val="en-US"/>
-        </w:rPr>
-        <w:t>gaji_lama</w:t>
-      </w:r>
-      <w:proofErr w:type="spellEnd"/>
-      <w:r>
-        <w:rPr>
-          <w:lang w:val="en-US"/>
-        </w:rPr>
-        <w:t>}</w:t>
+        <w:t xml:space="preserve">  {gaji_lama}</w:t>
       </w:r>
     </w:p>
     <w:p>
@@ -1611,77 +1082,7 @@
         <w:rPr>
           <w:lang w:val="en-US"/>
         </w:rPr>
-        <w:t xml:space="preserve">(Atas </w:t>
-      </w:r>
-      <w:proofErr w:type="spellStart"/>
-      <w:r>
-        <w:rPr>
-          <w:lang w:val="en-US"/>
-        </w:rPr>
-        <w:t>dasar</w:t>
-      </w:r>
-      <w:proofErr w:type="spellEnd"/>
-      <w:r>
-        <w:rPr>
-          <w:lang w:val="en-US"/>
-        </w:rPr>
-        <w:t xml:space="preserve"> Surat Keputusan </w:t>
-      </w:r>
-      <w:proofErr w:type="spellStart"/>
-      <w:r>
-        <w:rPr>
-          <w:lang w:val="en-US"/>
-        </w:rPr>
-        <w:t>tentang</w:t>
-      </w:r>
-      <w:proofErr w:type="spellEnd"/>
-      <w:r>
-        <w:rPr>
-          <w:lang w:val="en-US"/>
-        </w:rPr>
-        <w:t xml:space="preserve"> </w:t>
-      </w:r>
-      <w:proofErr w:type="spellStart"/>
-      <w:r>
-        <w:rPr>
-          <w:lang w:val="en-US"/>
-        </w:rPr>
-        <w:t>gaji</w:t>
-      </w:r>
-      <w:proofErr w:type="spellEnd"/>
-      <w:r>
-        <w:rPr>
-          <w:lang w:val="en-US"/>
-        </w:rPr>
-        <w:t>/</w:t>
-      </w:r>
-      <w:proofErr w:type="spellStart"/>
-      <w:r>
-        <w:rPr>
-          <w:lang w:val="en-US"/>
-        </w:rPr>
-        <w:t>pangkat</w:t>
-      </w:r>
-      <w:proofErr w:type="spellEnd"/>
-      <w:r>
-        <w:rPr>
-          <w:lang w:val="en-US"/>
-        </w:rPr>
-        <w:t xml:space="preserve"> yang </w:t>
-      </w:r>
-      <w:proofErr w:type="spellStart"/>
-      <w:r>
-        <w:rPr>
-          <w:lang w:val="en-US"/>
-        </w:rPr>
-        <w:t>ditetapkan</w:t>
-      </w:r>
-      <w:proofErr w:type="spellEnd"/>
-      <w:r>
-        <w:rPr>
-          <w:lang w:val="en-US"/>
-        </w:rPr>
-        <w:t xml:space="preserve"> oleh):</w:t>
+        <w:t>(Atas dasar Surat Keputusan tentang gaji/pangkat yang ditetapkan oleh):</w:t>
       </w:r>
     </w:p>
     <w:p>
@@ -1705,14 +1106,12 @@
           <w:lang w:val="en-US"/>
         </w:rPr>
       </w:pPr>
-      <w:proofErr w:type="spellStart"/>
       <w:r>
         <w:rPr>
           <w:lang w:val="en-US"/>
         </w:rPr>
         <w:t>Pejabat</w:t>
       </w:r>
-      <w:proofErr w:type="spellEnd"/>
       <w:r>
         <w:rPr>
           <w:lang w:val="en-US"/>
@@ -1752,14 +1151,12 @@
           <w:lang w:val="en-US"/>
         </w:rPr>
       </w:pPr>
-      <w:proofErr w:type="spellStart"/>
       <w:r>
         <w:rPr>
           <w:lang w:val="en-US"/>
         </w:rPr>
         <w:t>Tanggal</w:t>
       </w:r>
-      <w:proofErr w:type="spellEnd"/>
       <w:r>
         <w:rPr>
           <w:lang w:val="en-US"/>
@@ -1793,14 +1190,12 @@
           <w:lang w:val="en-US"/>
         </w:rPr>
       </w:pPr>
-      <w:proofErr w:type="spellStart"/>
       <w:r>
         <w:rPr>
           <w:lang w:val="en-US"/>
         </w:rPr>
         <w:t>Nomor</w:t>
       </w:r>
-      <w:proofErr w:type="spellEnd"/>
       <w:r>
         <w:rPr>
           <w:lang w:val="en-US"/>
@@ -1840,28 +1235,12 @@
           <w:lang w:val="en-US"/>
         </w:rPr>
       </w:pPr>
-      <w:proofErr w:type="spellStart"/>
-      <w:r>
-        <w:rPr>
-          <w:lang w:val="en-US"/>
-        </w:rPr>
-        <w:t>Tanggal</w:t>
-      </w:r>
-      <w:proofErr w:type="spellEnd"/>
-      <w:r>
-        <w:rPr>
-          <w:lang w:val="en-US"/>
-        </w:rPr>
-        <w:t xml:space="preserve"> </w:t>
-      </w:r>
-      <w:proofErr w:type="spellStart"/>
-      <w:r>
-        <w:rPr>
-          <w:lang w:val="en-US"/>
-        </w:rPr>
-        <w:t>Berlakunya</w:t>
-      </w:r>
-      <w:proofErr w:type="spellEnd"/>
+      <w:r>
+        <w:rPr>
+          <w:lang w:val="en-US"/>
+        </w:rPr>
+        <w:t>Tanggal Berlakunya</w:t>
+      </w:r>
       <w:r>
         <w:rPr>
           <w:lang w:val="en-US"/>
@@ -1904,41 +1283,32 @@
         <w:rPr>
           <w:lang w:val="en-US"/>
         </w:rPr>
-        <w:t xml:space="preserve">Masa </w:t>
-      </w:r>
-      <w:proofErr w:type="spellStart"/>
-      <w:r>
-        <w:rPr>
-          <w:lang w:val="en-US"/>
-        </w:rPr>
-        <w:t>Kerja</w:t>
-      </w:r>
-      <w:proofErr w:type="spellEnd"/>
-      <w:r>
-        <w:rPr>
-          <w:lang w:val="en-US"/>
-        </w:rPr>
-        <w:tab/>
-      </w:r>
-      <w:r>
-        <w:rPr>
-          <w:lang w:val="en-US"/>
-        </w:rPr>
-        <w:tab/>
-      </w:r>
-      <w:r>
-        <w:rPr>
-          <w:lang w:val="en-US"/>
-        </w:rPr>
-        <w:tab/>
-      </w:r>
-      <w:r>
-        <w:rPr>
-          <w:lang w:val="en-US"/>
-        </w:rPr>
-        <w:tab/>
-      </w:r>
-      <w:proofErr w:type="gramStart"/>
+        <w:t>Masa Kerja</w:t>
+      </w:r>
+      <w:r>
+        <w:rPr>
+          <w:lang w:val="en-US"/>
+        </w:rPr>
+        <w:tab/>
+      </w:r>
+      <w:r>
+        <w:rPr>
+          <w:lang w:val="en-US"/>
+        </w:rPr>
+        <w:tab/>
+      </w:r>
+      <w:r>
+        <w:rPr>
+          <w:lang w:val="en-US"/>
+        </w:rPr>
+        <w:tab/>
+      </w:r>
+      <w:r>
+        <w:rPr>
+          <w:lang w:val="en-US"/>
+        </w:rPr>
+        <w:tab/>
+      </w:r>
       <w:r>
         <w:rPr>
           <w:lang w:val="en-US"/>
@@ -1949,17 +1319,14 @@
         <w:rPr>
           <w:lang w:val="en-US"/>
         </w:rPr>
-        <w:t xml:space="preserve">  {</w:t>
-      </w:r>
-      <w:proofErr w:type="spellStart"/>
-      <w:proofErr w:type="gramEnd"/>
-      <w:r>
-        <w:rPr>
-          <w:lang w:val="en-US"/>
-        </w:rPr>
-        <w:t>masa_kerja</w:t>
-      </w:r>
-      <w:proofErr w:type="spellEnd"/>
+        <w:t xml:space="preserve">  {masa_kerja</w:t>
+      </w:r>
+      <w:r>
+        <w:rPr>
+          <w:lang w:val="en-US"/>
+        </w:rPr>
+        <w:t>_lama</w:t>
+      </w:r>
       <w:r>
         <w:rPr>
           <w:lang w:val="en-US"/>
@@ -1982,92 +1349,12 @@
           <w:lang w:val="en-US"/>
         </w:rPr>
       </w:pPr>
-      <w:proofErr w:type="spellStart"/>
-      <w:r>
-        <w:rPr>
-          <w:lang w:val="en-US"/>
-        </w:rPr>
-        <w:t>Diberikan</w:t>
-      </w:r>
-      <w:proofErr w:type="spellEnd"/>
-      <w:r>
-        <w:rPr>
-          <w:lang w:val="en-US"/>
-        </w:rPr>
-        <w:t xml:space="preserve"> </w:t>
-      </w:r>
-      <w:proofErr w:type="spellStart"/>
-      <w:r>
-        <w:rPr>
-          <w:lang w:val="en-US"/>
-        </w:rPr>
-        <w:t>Kenaikan</w:t>
-      </w:r>
-      <w:proofErr w:type="spellEnd"/>
-      <w:r>
-        <w:rPr>
-          <w:lang w:val="en-US"/>
-        </w:rPr>
-        <w:t xml:space="preserve"> </w:t>
-      </w:r>
-      <w:proofErr w:type="spellStart"/>
-      <w:r>
-        <w:rPr>
-          <w:lang w:val="en-US"/>
-        </w:rPr>
-        <w:t>Gaji</w:t>
-      </w:r>
-      <w:proofErr w:type="spellEnd"/>
-      <w:r>
-        <w:rPr>
-          <w:lang w:val="en-US"/>
-        </w:rPr>
-        <w:t xml:space="preserve"> </w:t>
-      </w:r>
-      <w:proofErr w:type="spellStart"/>
-      <w:r>
-        <w:rPr>
-          <w:lang w:val="en-US"/>
-        </w:rPr>
-        <w:t>Berkala</w:t>
-      </w:r>
-      <w:proofErr w:type="spellEnd"/>
-      <w:r>
-        <w:rPr>
-          <w:lang w:val="en-US"/>
-        </w:rPr>
-        <w:t xml:space="preserve"> </w:t>
-      </w:r>
-      <w:proofErr w:type="spellStart"/>
-      <w:r>
-        <w:rPr>
-          <w:lang w:val="en-US"/>
-        </w:rPr>
-        <w:t>hingga</w:t>
-      </w:r>
-      <w:proofErr w:type="spellEnd"/>
-      <w:r>
-        <w:rPr>
-          <w:lang w:val="en-US"/>
-        </w:rPr>
-        <w:t xml:space="preserve"> </w:t>
-      </w:r>
-      <w:proofErr w:type="spellStart"/>
-      <w:proofErr w:type="gramStart"/>
-      <w:r>
-        <w:rPr>
-          <w:lang w:val="en-US"/>
-        </w:rPr>
-        <w:t>memperoleh</w:t>
-      </w:r>
-      <w:proofErr w:type="spellEnd"/>
-      <w:r>
-        <w:rPr>
-          <w:lang w:val="en-US"/>
-        </w:rPr>
-        <w:t xml:space="preserve"> :</w:t>
-      </w:r>
-      <w:proofErr w:type="gramEnd"/>
+      <w:r>
+        <w:rPr>
+          <w:lang w:val="en-US"/>
+        </w:rPr>
+        <w:t>Diberikan Kenaikan Gaji Berkala hingga memperoleh :</w:t>
+      </w:r>
     </w:p>
     <w:p>
       <w:pPr>
@@ -2090,87 +1377,36 @@
           <w:lang w:val="en-US"/>
         </w:rPr>
       </w:pPr>
-      <w:proofErr w:type="spellStart"/>
-      <w:r>
-        <w:rPr>
-          <w:lang w:val="en-US"/>
-        </w:rPr>
-        <w:t>Gaji</w:t>
-      </w:r>
-      <w:proofErr w:type="spellEnd"/>
-      <w:r>
-        <w:rPr>
-          <w:lang w:val="en-US"/>
-        </w:rPr>
-        <w:t xml:space="preserve"> </w:t>
-      </w:r>
-      <w:proofErr w:type="spellStart"/>
-      <w:r>
-        <w:rPr>
-          <w:lang w:val="en-US"/>
-        </w:rPr>
-        <w:t>Pokok</w:t>
-      </w:r>
-      <w:proofErr w:type="spellEnd"/>
-      <w:r>
-        <w:rPr>
-          <w:lang w:val="en-US"/>
-        </w:rPr>
-        <w:t xml:space="preserve"> </w:t>
-      </w:r>
-      <w:proofErr w:type="spellStart"/>
-      <w:r>
-        <w:rPr>
-          <w:lang w:val="en-US"/>
-        </w:rPr>
-        <w:t>Baru</w:t>
-      </w:r>
-      <w:proofErr w:type="spellEnd"/>
-      <w:r>
-        <w:rPr>
-          <w:lang w:val="en-US"/>
-        </w:rPr>
-        <w:tab/>
-      </w:r>
-      <w:r>
-        <w:rPr>
-          <w:lang w:val="en-US"/>
-        </w:rPr>
-        <w:tab/>
-      </w:r>
-      <w:r>
-        <w:rPr>
-          <w:lang w:val="en-US"/>
-        </w:rPr>
-        <w:tab/>
-      </w:r>
-      <w:proofErr w:type="gramStart"/>
-      <w:r>
-        <w:rPr>
-          <w:lang w:val="en-US"/>
-        </w:rPr>
+      <w:r>
+        <w:rPr>
+          <w:lang w:val="en-US"/>
+        </w:rPr>
+        <w:t>Gaji Pokok Baru</w:t>
+      </w:r>
+      <w:r>
+        <w:rPr>
+          <w:lang w:val="en-US"/>
+        </w:rPr>
+        <w:tab/>
+      </w:r>
+      <w:r>
+        <w:rPr>
+          <w:lang w:val="en-US"/>
+        </w:rPr>
+        <w:tab/>
+      </w:r>
+      <w:r>
+        <w:rPr>
+          <w:lang w:val="en-US"/>
+        </w:rPr>
+        <w:tab/>
         <w:t>:</w:t>
       </w:r>
       <w:r>
         <w:rPr>
           <w:lang w:val="en-US"/>
         </w:rPr>
-        <w:t xml:space="preserve">  {</w:t>
-      </w:r>
-      <w:proofErr w:type="spellStart"/>
-      <w:proofErr w:type="gramEnd"/>
-      <w:r>
-        <w:rPr>
-          <w:lang w:val="en-US"/>
-        </w:rPr>
-        <w:t>gaji_baru</w:t>
-      </w:r>
-      <w:proofErr w:type="spellEnd"/>
-      <w:r>
-        <w:rPr>
-          <w:lang w:val="en-US"/>
-        </w:rPr>
-        <w:t>}</w:t>
+        <w:t xml:space="preserve">  {gaji_baru}</w:t>
       </w:r>
     </w:p>
     <w:p>
@@ -2186,62 +1422,39 @@
           <w:lang w:val="en-US"/>
         </w:rPr>
       </w:pPr>
-      <w:proofErr w:type="spellStart"/>
-      <w:r>
-        <w:rPr>
-          <w:lang w:val="en-US"/>
-        </w:rPr>
-        <w:t>Berdasarkan</w:t>
-      </w:r>
-      <w:proofErr w:type="spellEnd"/>
-      <w:r>
-        <w:rPr>
-          <w:lang w:val="en-US"/>
-        </w:rPr>
-        <w:t xml:space="preserve"> Masa </w:t>
-      </w:r>
-      <w:proofErr w:type="spellStart"/>
-      <w:r>
-        <w:rPr>
-          <w:lang w:val="en-US"/>
-        </w:rPr>
-        <w:t>Kerja</w:t>
-      </w:r>
-      <w:proofErr w:type="spellEnd"/>
-      <w:r>
-        <w:rPr>
-          <w:lang w:val="en-US"/>
-        </w:rPr>
-        <w:tab/>
-      </w:r>
-      <w:r>
-        <w:rPr>
-          <w:lang w:val="en-US"/>
-        </w:rPr>
-        <w:tab/>
-      </w:r>
-      <w:proofErr w:type="gramStart"/>
-      <w:r>
-        <w:rPr>
-          <w:lang w:val="en-US"/>
-        </w:rPr>
+      <w:r>
+        <w:rPr>
+          <w:lang w:val="en-US"/>
+        </w:rPr>
+        <w:t>Berdasarkan Masa Kerja</w:t>
+      </w:r>
+      <w:r>
+        <w:rPr>
+          <w:lang w:val="en-US"/>
+        </w:rPr>
+        <w:tab/>
+      </w:r>
+      <w:r>
+        <w:rPr>
+          <w:lang w:val="en-US"/>
+        </w:rPr>
+        <w:tab/>
         <w:t>:</w:t>
       </w:r>
       <w:r>
         <w:rPr>
           <w:lang w:val="en-US"/>
         </w:rPr>
-        <w:t xml:space="preserve">  {</w:t>
-      </w:r>
-      <w:proofErr w:type="spellStart"/>
-      <w:proofErr w:type="gramEnd"/>
-      <w:r>
-        <w:rPr>
-          <w:lang w:val="en-US"/>
-        </w:rPr>
-        <w:t>masa_kerja</w:t>
-      </w:r>
-      <w:proofErr w:type="spellEnd"/>
+        <w:t xml:space="preserve">  {masa_kerja</w:t>
+      </w:r>
+      <w:r>
+        <w:rPr>
+          <w:lang w:val="en-US"/>
+        </w:rPr>
+        <w:t>_baru</w:t>
+      </w:r>
+      <w:bookmarkStart w:id="0" w:name="_GoBack"/>
+      <w:bookmarkEnd w:id="0"/>
       <w:r>
         <w:rPr>
           <w:lang w:val="en-US"/>
@@ -2266,61 +1479,32 @@
         <w:rPr>
           <w:lang w:val="en-US"/>
         </w:rPr>
-        <w:t xml:space="preserve">Dalam </w:t>
-      </w:r>
-      <w:proofErr w:type="spellStart"/>
-      <w:r>
-        <w:rPr>
-          <w:lang w:val="en-US"/>
-        </w:rPr>
-        <w:t>Golongan</w:t>
-      </w:r>
-      <w:proofErr w:type="spellEnd"/>
-      <w:r>
-        <w:rPr>
-          <w:lang w:val="en-US"/>
-        </w:rPr>
-        <w:tab/>
-      </w:r>
-      <w:r>
-        <w:rPr>
-          <w:lang w:val="en-US"/>
-        </w:rPr>
-        <w:tab/>
-      </w:r>
-      <w:r>
-        <w:rPr>
-          <w:lang w:val="en-US"/>
-        </w:rPr>
-        <w:tab/>
-      </w:r>
-      <w:proofErr w:type="gramStart"/>
-      <w:r>
-        <w:rPr>
-          <w:lang w:val="en-US"/>
-        </w:rPr>
+        <w:t>Dalam Golongan</w:t>
+      </w:r>
+      <w:r>
+        <w:rPr>
+          <w:lang w:val="en-US"/>
+        </w:rPr>
+        <w:tab/>
+      </w:r>
+      <w:r>
+        <w:rPr>
+          <w:lang w:val="en-US"/>
+        </w:rPr>
+        <w:tab/>
+      </w:r>
+      <w:r>
+        <w:rPr>
+          <w:lang w:val="en-US"/>
+        </w:rPr>
+        <w:tab/>
         <w:t>:</w:t>
       </w:r>
       <w:r>
         <w:rPr>
           <w:lang w:val="en-US"/>
         </w:rPr>
-        <w:t xml:space="preserve">  {</w:t>
-      </w:r>
-      <w:proofErr w:type="spellStart"/>
-      <w:proofErr w:type="gramEnd"/>
-      <w:r>
-        <w:rPr>
-          <w:lang w:val="en-US"/>
-        </w:rPr>
-        <w:t>dalam_golongan</w:t>
-      </w:r>
-      <w:proofErr w:type="spellEnd"/>
-      <w:r>
-        <w:rPr>
-          <w:lang w:val="en-US"/>
-        </w:rPr>
-        <w:t>}</w:t>
+        <w:t xml:space="preserve">  {dalam_golongan}</w:t>
       </w:r>
     </w:p>
     <w:p>
@@ -2340,61 +1524,32 @@
         <w:rPr>
           <w:lang w:val="en-US"/>
         </w:rPr>
-        <w:t xml:space="preserve">Mulai </w:t>
-      </w:r>
-      <w:proofErr w:type="spellStart"/>
-      <w:r>
-        <w:rPr>
-          <w:lang w:val="en-US"/>
-        </w:rPr>
-        <w:t>Tanggal</w:t>
-      </w:r>
-      <w:proofErr w:type="spellEnd"/>
-      <w:r>
-        <w:rPr>
-          <w:lang w:val="en-US"/>
-        </w:rPr>
-        <w:tab/>
-      </w:r>
-      <w:r>
-        <w:rPr>
-          <w:lang w:val="en-US"/>
-        </w:rPr>
-        <w:tab/>
-      </w:r>
-      <w:r>
-        <w:rPr>
-          <w:lang w:val="en-US"/>
-        </w:rPr>
-        <w:tab/>
-      </w:r>
-      <w:proofErr w:type="gramStart"/>
-      <w:r>
-        <w:rPr>
-          <w:lang w:val="en-US"/>
-        </w:rPr>
+        <w:t>Mulai Tanggal</w:t>
+      </w:r>
+      <w:r>
+        <w:rPr>
+          <w:lang w:val="en-US"/>
+        </w:rPr>
+        <w:tab/>
+      </w:r>
+      <w:r>
+        <w:rPr>
+          <w:lang w:val="en-US"/>
+        </w:rPr>
+        <w:tab/>
+      </w:r>
+      <w:r>
+        <w:rPr>
+          <w:lang w:val="en-US"/>
+        </w:rPr>
+        <w:tab/>
         <w:t>:</w:t>
       </w:r>
       <w:r>
         <w:rPr>
           <w:lang w:val="en-US"/>
         </w:rPr>
-        <w:t xml:space="preserve">  {</w:t>
-      </w:r>
-      <w:proofErr w:type="spellStart"/>
-      <w:proofErr w:type="gramEnd"/>
-      <w:r>
-        <w:rPr>
-          <w:lang w:val="en-US"/>
-        </w:rPr>
-        <w:t>tanggal_pengangkatan</w:t>
-      </w:r>
-      <w:proofErr w:type="spellEnd"/>
-      <w:r>
-        <w:rPr>
-          <w:lang w:val="en-US"/>
-        </w:rPr>
-        <w:t>}</w:t>
+        <w:t xml:space="preserve">  {tanggal_pengangkatan}</w:t>
       </w:r>
     </w:p>
     <w:p>
@@ -2410,81 +1565,30 @@
           <w:lang w:val="en-US"/>
         </w:rPr>
       </w:pPr>
-      <w:proofErr w:type="spellStart"/>
-      <w:r>
-        <w:rPr>
-          <w:lang w:val="en-US"/>
-        </w:rPr>
-        <w:t>Gaji</w:t>
-      </w:r>
-      <w:proofErr w:type="spellEnd"/>
-      <w:r>
-        <w:rPr>
-          <w:lang w:val="en-US"/>
-        </w:rPr>
-        <w:t xml:space="preserve"> </w:t>
-      </w:r>
-      <w:proofErr w:type="spellStart"/>
-      <w:r>
-        <w:rPr>
-          <w:lang w:val="en-US"/>
-        </w:rPr>
-        <w:t>Berkala</w:t>
-      </w:r>
-      <w:proofErr w:type="spellEnd"/>
-      <w:r>
-        <w:rPr>
-          <w:lang w:val="en-US"/>
-        </w:rPr>
-        <w:t xml:space="preserve"> </w:t>
-      </w:r>
-      <w:proofErr w:type="spellStart"/>
-      <w:r>
-        <w:rPr>
-          <w:lang w:val="en-US"/>
-        </w:rPr>
-        <w:t>Berikutnya</w:t>
-      </w:r>
-      <w:proofErr w:type="spellEnd"/>
-      <w:r>
-        <w:rPr>
-          <w:lang w:val="en-US"/>
-        </w:rPr>
-        <w:tab/>
-      </w:r>
-      <w:r>
-        <w:rPr>
-          <w:lang w:val="en-US"/>
-        </w:rPr>
-        <w:tab/>
-      </w:r>
-      <w:proofErr w:type="gramStart"/>
-      <w:r>
-        <w:rPr>
-          <w:lang w:val="en-US"/>
-        </w:rPr>
+      <w:r>
+        <w:rPr>
+          <w:lang w:val="en-US"/>
+        </w:rPr>
+        <w:t>Gaji Berkala Berikutnya</w:t>
+      </w:r>
+      <w:r>
+        <w:rPr>
+          <w:lang w:val="en-US"/>
+        </w:rPr>
+        <w:tab/>
+      </w:r>
+      <w:r>
+        <w:rPr>
+          <w:lang w:val="en-US"/>
+        </w:rPr>
+        <w:tab/>
         <w:t>:</w:t>
       </w:r>
       <w:r>
         <w:rPr>
           <w:lang w:val="en-US"/>
         </w:rPr>
-        <w:t xml:space="preserve">  {</w:t>
-      </w:r>
-      <w:proofErr w:type="spellStart"/>
-      <w:proofErr w:type="gramEnd"/>
-      <w:r>
-        <w:rPr>
-          <w:lang w:val="en-US"/>
-        </w:rPr>
-        <w:t>tahun_kgb_berikutnya</w:t>
-      </w:r>
-      <w:proofErr w:type="spellEnd"/>
-      <w:r>
-        <w:rPr>
-          <w:lang w:val="en-US"/>
-        </w:rPr>
-        <w:t>}</w:t>
+        <w:t xml:space="preserve">  {tahun_kgb_berikutnya}</w:t>
       </w:r>
     </w:p>
     <w:p>
@@ -2505,257 +1609,11 @@
           <w:lang w:val="en-US"/>
         </w:rPr>
       </w:pPr>
-      <w:proofErr w:type="spellStart"/>
-      <w:r>
-        <w:rPr>
-          <w:lang w:val="en-US"/>
-        </w:rPr>
-        <w:t>Diharapkan</w:t>
-      </w:r>
-      <w:proofErr w:type="spellEnd"/>
-      <w:r>
-        <w:rPr>
-          <w:lang w:val="en-US"/>
-        </w:rPr>
-        <w:t xml:space="preserve"> </w:t>
-      </w:r>
-      <w:proofErr w:type="spellStart"/>
-      <w:r>
-        <w:rPr>
-          <w:lang w:val="en-US"/>
-        </w:rPr>
-        <w:t>sesuai</w:t>
-      </w:r>
-      <w:proofErr w:type="spellEnd"/>
-      <w:r>
-        <w:rPr>
-          <w:lang w:val="en-US"/>
-        </w:rPr>
-        <w:t xml:space="preserve"> </w:t>
-      </w:r>
-      <w:proofErr w:type="spellStart"/>
-      <w:r>
-        <w:rPr>
-          <w:lang w:val="en-US"/>
-        </w:rPr>
-        <w:t>dengan</w:t>
-      </w:r>
-      <w:proofErr w:type="spellEnd"/>
-      <w:r>
-        <w:rPr>
-          <w:lang w:val="en-US"/>
-        </w:rPr>
-        <w:t xml:space="preserve"> </w:t>
-      </w:r>
-      <w:proofErr w:type="spellStart"/>
-      <w:r>
-        <w:rPr>
-          <w:lang w:val="en-US"/>
-        </w:rPr>
-        <w:t>Peraturan</w:t>
-      </w:r>
-      <w:proofErr w:type="spellEnd"/>
-      <w:r>
-        <w:rPr>
-          <w:lang w:val="en-US"/>
-        </w:rPr>
-        <w:t xml:space="preserve"> </w:t>
-      </w:r>
-      <w:proofErr w:type="spellStart"/>
-      <w:r>
-        <w:rPr>
-          <w:lang w:val="en-US"/>
-        </w:rPr>
-        <w:t>Pemerintah</w:t>
-      </w:r>
-      <w:proofErr w:type="spellEnd"/>
-      <w:r>
-        <w:rPr>
-          <w:lang w:val="en-US"/>
-        </w:rPr>
-        <w:t xml:space="preserve"> </w:t>
-      </w:r>
-      <w:proofErr w:type="spellStart"/>
-      <w:r>
-        <w:rPr>
-          <w:lang w:val="en-US"/>
-        </w:rPr>
-        <w:t>Nomor</w:t>
-      </w:r>
-      <w:proofErr w:type="spellEnd"/>
-      <w:r>
-        <w:rPr>
-          <w:lang w:val="en-US"/>
-        </w:rPr>
-        <w:t xml:space="preserve"> 5 </w:t>
-      </w:r>
-      <w:proofErr w:type="spellStart"/>
-      <w:r>
-        <w:rPr>
-          <w:lang w:val="en-US"/>
-        </w:rPr>
-        <w:t>Tahun</w:t>
-      </w:r>
-      <w:proofErr w:type="spellEnd"/>
-      <w:r>
-        <w:rPr>
-          <w:lang w:val="en-US"/>
-        </w:rPr>
-        <w:t xml:space="preserve"> 2024 </w:t>
-      </w:r>
-      <w:proofErr w:type="spellStart"/>
-      <w:r>
-        <w:rPr>
-          <w:lang w:val="en-US"/>
-        </w:rPr>
-        <w:t>tanggal</w:t>
-      </w:r>
-      <w:proofErr w:type="spellEnd"/>
-      <w:r>
-        <w:rPr>
-          <w:lang w:val="en-US"/>
-        </w:rPr>
-        <w:t xml:space="preserve"> 26 Januari 2024 </w:t>
-      </w:r>
-      <w:proofErr w:type="spellStart"/>
-      <w:r>
-        <w:rPr>
-          <w:lang w:val="en-US"/>
-        </w:rPr>
-        <w:t>Kepada</w:t>
-      </w:r>
-      <w:proofErr w:type="spellEnd"/>
-      <w:r>
-        <w:rPr>
-          <w:lang w:val="en-US"/>
-        </w:rPr>
-        <w:t xml:space="preserve"> </w:t>
-      </w:r>
-      <w:proofErr w:type="spellStart"/>
-      <w:r>
-        <w:rPr>
-          <w:lang w:val="en-US"/>
-        </w:rPr>
-        <w:t>Pegawai</w:t>
-      </w:r>
-      <w:proofErr w:type="spellEnd"/>
-      <w:r>
-        <w:rPr>
-          <w:lang w:val="en-US"/>
-        </w:rPr>
-        <w:t xml:space="preserve"> Negeri </w:t>
-      </w:r>
-      <w:proofErr w:type="spellStart"/>
-      <w:r>
-        <w:rPr>
-          <w:lang w:val="en-US"/>
-        </w:rPr>
-        <w:t>Sipil</w:t>
-      </w:r>
-      <w:proofErr w:type="spellEnd"/>
-      <w:r>
-        <w:rPr>
-          <w:lang w:val="en-US"/>
-        </w:rPr>
-        <w:t xml:space="preserve"> </w:t>
-      </w:r>
-      <w:proofErr w:type="spellStart"/>
-      <w:r>
-        <w:rPr>
-          <w:lang w:val="en-US"/>
-        </w:rPr>
-        <w:t>tersebut</w:t>
-      </w:r>
-      <w:proofErr w:type="spellEnd"/>
-      <w:r>
-        <w:rPr>
-          <w:lang w:val="en-US"/>
-        </w:rPr>
-        <w:t xml:space="preserve"> agar </w:t>
-      </w:r>
-      <w:proofErr w:type="spellStart"/>
-      <w:r>
-        <w:rPr>
-          <w:lang w:val="en-US"/>
-        </w:rPr>
-        <w:t>dapat</w:t>
-      </w:r>
-      <w:proofErr w:type="spellEnd"/>
-      <w:r>
-        <w:rPr>
-          <w:lang w:val="en-US"/>
-        </w:rPr>
-        <w:t xml:space="preserve"> </w:t>
-      </w:r>
-      <w:proofErr w:type="spellStart"/>
-      <w:r>
-        <w:rPr>
-          <w:lang w:val="en-US"/>
-        </w:rPr>
-        <w:t>dibayarkan</w:t>
-      </w:r>
-      <w:proofErr w:type="spellEnd"/>
-      <w:r>
-        <w:rPr>
-          <w:lang w:val="en-US"/>
-        </w:rPr>
-        <w:t xml:space="preserve"> </w:t>
-      </w:r>
-      <w:proofErr w:type="spellStart"/>
-      <w:r>
-        <w:rPr>
-          <w:lang w:val="en-US"/>
-        </w:rPr>
-        <w:t>penghasilannya</w:t>
-      </w:r>
-      <w:proofErr w:type="spellEnd"/>
-      <w:r>
-        <w:rPr>
-          <w:lang w:val="en-US"/>
-        </w:rPr>
-        <w:t xml:space="preserve"> </w:t>
-      </w:r>
-      <w:proofErr w:type="spellStart"/>
-      <w:r>
-        <w:rPr>
-          <w:lang w:val="en-US"/>
-        </w:rPr>
-        <w:t>berdasarkan</w:t>
-      </w:r>
-      <w:proofErr w:type="spellEnd"/>
-      <w:r>
-        <w:rPr>
-          <w:lang w:val="en-US"/>
-        </w:rPr>
-        <w:t xml:space="preserve"> </w:t>
-      </w:r>
-      <w:proofErr w:type="spellStart"/>
-      <w:r>
-        <w:rPr>
-          <w:lang w:val="en-US"/>
-        </w:rPr>
-        <w:t>gajinya</w:t>
-      </w:r>
-      <w:proofErr w:type="spellEnd"/>
-      <w:r>
-        <w:rPr>
-          <w:lang w:val="en-US"/>
-        </w:rPr>
-        <w:t xml:space="preserve"> yang </w:t>
-      </w:r>
-      <w:proofErr w:type="spellStart"/>
-      <w:r>
-        <w:rPr>
-          <w:lang w:val="en-US"/>
-        </w:rPr>
-        <w:t>baru</w:t>
-      </w:r>
-      <w:proofErr w:type="spellEnd"/>
-      <w:r>
-        <w:rPr>
-          <w:lang w:val="en-US"/>
-        </w:rPr>
-        <w:t>.</w:t>
+      <w:r>
+        <w:rPr>
+          <w:lang w:val="en-US"/>
+        </w:rPr>
+        <w:t>Diharapkan sesuai dengan Peraturan Pemerintah Nomor 5 Tahun 2024 tanggal 26 Januari 2024 Kepada Pegawai Negeri Sipil tersebut agar dapat dibayarkan penghasilannya berdasarkan gajinya yang baru.</w:t>
       </w:r>
     </w:p>
     <w:p>
@@ -3012,7 +1870,6 @@
           <w:b/>
         </w:rPr>
       </w:pPr>
-      <w:proofErr w:type="spellStart"/>
       <w:r>
         <w:rPr>
           <w:rFonts w:ascii="Arial"/>
@@ -3020,29 +1877,8 @@
           <w:u w:val="thick"/>
           <w:lang w:val="en-US"/>
         </w:rPr>
-        <w:t>Rudhy</w:t>
-      </w:r>
-      <w:proofErr w:type="spellEnd"/>
-      <w:r>
-        <w:rPr>
-          <w:rFonts w:ascii="Arial"/>
-          <w:b/>
-          <w:u w:val="thick"/>
-          <w:lang w:val="en-US"/>
-        </w:rPr>
-        <w:t xml:space="preserve"> </w:t>
-      </w:r>
-      <w:proofErr w:type="spellStart"/>
-      <w:r>
-        <w:rPr>
-          <w:rFonts w:ascii="Arial"/>
-          <w:b/>
-          <w:u w:val="thick"/>
-          <w:lang w:val="en-US"/>
-        </w:rPr>
-        <w:t>Parhusip</w:t>
-      </w:r>
-      <w:proofErr w:type="spellEnd"/>
+        <w:t>Rudhy Parhusip</w:t>
+      </w:r>
       <w:r>
         <w:rPr>
           <w:rFonts w:ascii="Arial"/>
@@ -3613,7 +2449,7 @@
 </file>
 
 <file path=word/endnotes.xml><?xml version="1.0" encoding="utf-8"?>
-<w:endnotes xmlns:wpc="http://schemas.microsoft.com/office/word/2010/wordprocessingCanvas" xmlns:cx="http://schemas.microsoft.com/office/drawing/2014/chartex" xmlns:cx1="http://schemas.microsoft.com/office/drawing/2015/9/8/chartex" xmlns:cx2="http://schemas.microsoft.com/office/drawing/2015/10/21/chartex" xmlns:cx3="http://schemas.microsoft.com/office/drawing/2016/5/9/chartex" xmlns:cx4="http://schemas.microsoft.com/office/drawing/2016/5/10/chartex" xmlns:cx5="http://schemas.microsoft.com/office/drawing/2016/5/11/chartex" xmlns:cx6="http://schemas.microsoft.com/office/drawing/2016/5/12/chartex" xmlns:cx7="http://schemas.microsoft.com/office/drawing/2016/5/13/chartex" xmlns:cx8="http://schemas.microsoft.com/office/drawing/2016/5/14/chartex" xmlns:mc="http://schemas.openxmlformats.org/markup-compatibility/2006" xmlns:aink="http://schemas.microsoft.com/office/drawing/2016/ink" xmlns:am3d="http://schemas.microsoft.com/office/drawing/2017/model3d" xmlns:o="urn:schemas-microsoft-com:office:office" xmlns:r="http://schemas.openxmlformats.org/officeDocument/2006/relationships" xmlns:m="http://schemas.openxmlformats.org/officeDocument/2006/math" xmlns:v="urn:schemas-microsoft-com:vml" xmlns:wp14="http://schemas.microsoft.com/office/word/2010/wordprocessingDrawing" xmlns:wp="http://schemas.openxmlformats.org/drawingml/2006/wordprocessingDrawing" xmlns:w10="urn:schemas-microsoft-com:office:word" xmlns:w="http://schemas.openxmlformats.org/wordprocessingml/2006/main" xmlns:w14="http://schemas.microsoft.com/office/word/2010/wordml" xmlns:w15="http://schemas.microsoft.com/office/word/2012/wordml" xmlns:w16cex="http://schemas.microsoft.com/office/word/2018/wordml/cex" xmlns:w16cid="http://schemas.microsoft.com/office/word/2016/wordml/cid" xmlns:w16="http://schemas.microsoft.com/office/word/2018/wordml" xmlns:w16sdtdh="http://schemas.microsoft.com/office/word/2020/wordml/sdtdatahash" xmlns:w16se="http://schemas.microsoft.com/office/word/2015/wordml/symex" xmlns:wpg="http://schemas.microsoft.com/office/word/2010/wordprocessingGroup" xmlns:wpi="http://schemas.microsoft.com/office/word/2010/wordprocessingInk" xmlns:wne="http://schemas.microsoft.com/office/word/2006/wordml" xmlns:wps="http://schemas.microsoft.com/office/word/2010/wordprocessingShape" mc:Ignorable="w14 w15 w16se w16cid w16 w16cex w16sdtdh wp14">
+<w:endnotes xmlns:wpc="http://schemas.microsoft.com/office/word/2010/wordprocessingCanvas" xmlns:mc="http://schemas.openxmlformats.org/markup-compatibility/2006" xmlns:o="urn:schemas-microsoft-com:office:office" xmlns:r="http://schemas.openxmlformats.org/officeDocument/2006/relationships" xmlns:m="http://schemas.openxmlformats.org/officeDocument/2006/math" xmlns:v="urn:schemas-microsoft-com:vml" xmlns:wp14="http://schemas.microsoft.com/office/word/2010/wordprocessingDrawing" xmlns:wp="http://schemas.openxmlformats.org/drawingml/2006/wordprocessingDrawing" xmlns:w10="urn:schemas-microsoft-com:office:word" xmlns:w="http://schemas.openxmlformats.org/wordprocessingml/2006/main" xmlns:w14="http://schemas.microsoft.com/office/word/2010/wordml" xmlns:w15="http://schemas.microsoft.com/office/word/2012/wordml" xmlns:wpg="http://schemas.microsoft.com/office/word/2010/wordprocessingGroup" xmlns:wpi="http://schemas.microsoft.com/office/word/2010/wordprocessingInk" xmlns:wne="http://schemas.microsoft.com/office/word/2006/wordml" xmlns:wps="http://schemas.microsoft.com/office/word/2010/wordprocessingShape" mc:Ignorable="w14 w15 wp14">
   <w:endnote w:type="separator" w:id="-1">
     <w:p>
       <w:pPr>
@@ -3638,7 +2474,7 @@
 </file>
 
 <file path=word/footnotes.xml><?xml version="1.0" encoding="utf-8"?>
-<w:footnotes xmlns:wpc="http://schemas.microsoft.com/office/word/2010/wordprocessingCanvas" xmlns:cx="http://schemas.microsoft.com/office/drawing/2014/chartex" xmlns:cx1="http://schemas.microsoft.com/office/drawing/2015/9/8/chartex" xmlns:cx2="http://schemas.microsoft.com/office/drawing/2015/10/21/chartex" xmlns:cx3="http://schemas.microsoft.com/office/drawing/2016/5/9/chartex" xmlns:cx4="http://schemas.microsoft.com/office/drawing/2016/5/10/chartex" xmlns:cx5="http://schemas.microsoft.com/office/drawing/2016/5/11/chartex" xmlns:cx6="http://schemas.microsoft.com/office/drawing/2016/5/12/chartex" xmlns:cx7="http://schemas.microsoft.com/office/drawing/2016/5/13/chartex" xmlns:cx8="http://schemas.microsoft.com/office/drawing/2016/5/14/chartex" xmlns:mc="http://schemas.openxmlformats.org/markup-compatibility/2006" xmlns:aink="http://schemas.microsoft.com/office/drawing/2016/ink" xmlns:am3d="http://schemas.microsoft.com/office/drawing/2017/model3d" xmlns:o="urn:schemas-microsoft-com:office:office" xmlns:r="http://schemas.openxmlformats.org/officeDocument/2006/relationships" xmlns:m="http://schemas.openxmlformats.org/officeDocument/2006/math" xmlns:v="urn:schemas-microsoft-com:vml" xmlns:wp14="http://schemas.microsoft.com/office/word/2010/wordprocessingDrawing" xmlns:wp="http://schemas.openxmlformats.org/drawingml/2006/wordprocessingDrawing" xmlns:w10="urn:schemas-microsoft-com:office:word" xmlns:w="http://schemas.openxmlformats.org/wordprocessingml/2006/main" xmlns:w14="http://schemas.microsoft.com/office/word/2010/wordml" xmlns:w15="http://schemas.microsoft.com/office/word/2012/wordml" xmlns:w16cex="http://schemas.microsoft.com/office/word/2018/wordml/cex" xmlns:w16cid="http://schemas.microsoft.com/office/word/2016/wordml/cid" xmlns:w16="http://schemas.microsoft.com/office/word/2018/wordml" xmlns:w16sdtdh="http://schemas.microsoft.com/office/word/2020/wordml/sdtdatahash" xmlns:w16se="http://schemas.microsoft.com/office/word/2015/wordml/symex" xmlns:wpg="http://schemas.microsoft.com/office/word/2010/wordprocessingGroup" xmlns:wpi="http://schemas.microsoft.com/office/word/2010/wordprocessingInk" xmlns:wne="http://schemas.microsoft.com/office/word/2006/wordml" xmlns:wps="http://schemas.microsoft.com/office/word/2010/wordprocessingShape" mc:Ignorable="w14 w15 w16se w16cid w16 w16cex w16sdtdh wp14">
+<w:footnotes xmlns:wpc="http://schemas.microsoft.com/office/word/2010/wordprocessingCanvas" xmlns:mc="http://schemas.openxmlformats.org/markup-compatibility/2006" xmlns:o="urn:schemas-microsoft-com:office:office" xmlns:r="http://schemas.openxmlformats.org/officeDocument/2006/relationships" xmlns:m="http://schemas.openxmlformats.org/officeDocument/2006/math" xmlns:v="urn:schemas-microsoft-com:vml" xmlns:wp14="http://schemas.microsoft.com/office/word/2010/wordprocessingDrawing" xmlns:wp="http://schemas.openxmlformats.org/drawingml/2006/wordprocessingDrawing" xmlns:w10="urn:schemas-microsoft-com:office:word" xmlns:w="http://schemas.openxmlformats.org/wordprocessingml/2006/main" xmlns:w14="http://schemas.microsoft.com/office/word/2010/wordml" xmlns:w15="http://schemas.microsoft.com/office/word/2012/wordml" xmlns:wpg="http://schemas.microsoft.com/office/word/2010/wordprocessingGroup" xmlns:wpi="http://schemas.microsoft.com/office/word/2010/wordprocessingInk" xmlns:wne="http://schemas.microsoft.com/office/word/2006/wordml" xmlns:wps="http://schemas.microsoft.com/office/word/2010/wordprocessingShape" mc:Ignorable="w14 w15 wp14">
   <w:footnote w:type="separator" w:id="-1">
     <w:p>
       <w:pPr>
@@ -3663,7 +2499,7 @@
 </file>
 
 <file path=word/header1.xml><?xml version="1.0" encoding="utf-8"?>
-<w:hdr xmlns:wpc="http://schemas.microsoft.com/office/word/2010/wordprocessingCanvas" xmlns:cx="http://schemas.microsoft.com/office/drawing/2014/chartex" xmlns:cx1="http://schemas.microsoft.com/office/drawing/2015/9/8/chartex" xmlns:cx2="http://schemas.microsoft.com/office/drawing/2015/10/21/chartex" xmlns:cx3="http://schemas.microsoft.com/office/drawing/2016/5/9/chartex" xmlns:cx4="http://schemas.microsoft.com/office/drawing/2016/5/10/chartex" xmlns:cx5="http://schemas.microsoft.com/office/drawing/2016/5/11/chartex" xmlns:cx6="http://schemas.microsoft.com/office/drawing/2016/5/12/chartex" xmlns:cx7="http://schemas.microsoft.com/office/drawing/2016/5/13/chartex" xmlns:cx8="http://schemas.microsoft.com/office/drawing/2016/5/14/chartex" xmlns:mc="http://schemas.openxmlformats.org/markup-compatibility/2006" xmlns:aink="http://schemas.microsoft.com/office/drawing/2016/ink" xmlns:am3d="http://schemas.microsoft.com/office/drawing/2017/model3d" xmlns:o="urn:schemas-microsoft-com:office:office" xmlns:r="http://schemas.openxmlformats.org/officeDocument/2006/relationships" xmlns:m="http://schemas.openxmlformats.org/officeDocument/2006/math" xmlns:v="urn:schemas-microsoft-com:vml" xmlns:wp14="http://schemas.microsoft.com/office/word/2010/wordprocessingDrawing" xmlns:wp="http://schemas.openxmlformats.org/drawingml/2006/wordprocessingDrawing" xmlns:w10="urn:schemas-microsoft-com:office:word" xmlns:w="http://schemas.openxmlformats.org/wordprocessingml/2006/main" xmlns:w14="http://schemas.microsoft.com/office/word/2010/wordml" xmlns:w15="http://schemas.microsoft.com/office/word/2012/wordml" xmlns:w16cex="http://schemas.microsoft.com/office/word/2018/wordml/cex" xmlns:w16cid="http://schemas.microsoft.com/office/word/2016/wordml/cid" xmlns:w16="http://schemas.microsoft.com/office/word/2018/wordml" xmlns:w16sdtdh="http://schemas.microsoft.com/office/word/2020/wordml/sdtdatahash" xmlns:w16se="http://schemas.microsoft.com/office/word/2015/wordml/symex" xmlns:wpg="http://schemas.microsoft.com/office/word/2010/wordprocessingGroup" xmlns:wpi="http://schemas.microsoft.com/office/word/2010/wordprocessingInk" xmlns:wne="http://schemas.microsoft.com/office/word/2006/wordml" xmlns:wps="http://schemas.microsoft.com/office/word/2010/wordprocessingShape" mc:Ignorable="w14 w15 w16se w16cid w16 w16cex w16sdtdh wp14">
+<w:hdr xmlns:wpc="http://schemas.microsoft.com/office/word/2010/wordprocessingCanvas" xmlns:mc="http://schemas.openxmlformats.org/markup-compatibility/2006" xmlns:o="urn:schemas-microsoft-com:office:office" xmlns:r="http://schemas.openxmlformats.org/officeDocument/2006/relationships" xmlns:m="http://schemas.openxmlformats.org/officeDocument/2006/math" xmlns:v="urn:schemas-microsoft-com:vml" xmlns:wp14="http://schemas.microsoft.com/office/word/2010/wordprocessingDrawing" xmlns:wp="http://schemas.openxmlformats.org/drawingml/2006/wordprocessingDrawing" xmlns:w10="urn:schemas-microsoft-com:office:word" xmlns:w="http://schemas.openxmlformats.org/wordprocessingml/2006/main" xmlns:w14="http://schemas.microsoft.com/office/word/2010/wordml" xmlns:w15="http://schemas.microsoft.com/office/word/2012/wordml" xmlns:wpg="http://schemas.microsoft.com/office/word/2010/wordprocessingGroup" xmlns:wpi="http://schemas.microsoft.com/office/word/2010/wordprocessingInk" xmlns:wne="http://schemas.microsoft.com/office/word/2006/wordml" xmlns:wps="http://schemas.microsoft.com/office/word/2010/wordprocessingShape" mc:Ignorable="w14 w15 wp14">
   <w:p>
     <w:pPr>
       <w:pStyle w:val="Header"/>
@@ -3679,7 +2515,7 @@
 </file>
 
 <file path=word/numbering.xml><?xml version="1.0" encoding="utf-8"?>
-<w:numbering xmlns:wpc="http://schemas.microsoft.com/office/word/2010/wordprocessingCanvas" xmlns:cx="http://schemas.microsoft.com/office/drawing/2014/chartex" xmlns:cx1="http://schemas.microsoft.com/office/drawing/2015/9/8/chartex" xmlns:cx2="http://schemas.microsoft.com/office/drawing/2015/10/21/chartex" xmlns:cx3="http://schemas.microsoft.com/office/drawing/2016/5/9/chartex" xmlns:cx4="http://schemas.microsoft.com/office/drawing/2016/5/10/chartex" xmlns:cx5="http://schemas.microsoft.com/office/drawing/2016/5/11/chartex" xmlns:cx6="http://schemas.microsoft.com/office/drawing/2016/5/12/chartex" xmlns:cx7="http://schemas.microsoft.com/office/drawing/2016/5/13/chartex" xmlns:cx8="http://schemas.microsoft.com/office/drawing/2016/5/14/chartex" xmlns:mc="http://schemas.openxmlformats.org/markup-compatibility/2006" xmlns:aink="http://schemas.microsoft.com/office/drawing/2016/ink" xmlns:am3d="http://schemas.microsoft.com/office/drawing/2017/model3d" xmlns:o="urn:schemas-microsoft-com:office:office" xmlns:r="http://schemas.openxmlformats.org/officeDocument/2006/relationships" xmlns:m="http://schemas.openxmlformats.org/officeDocument/2006/math" xmlns:v="urn:schemas-microsoft-com:vml" xmlns:wp14="http://schemas.microsoft.com/office/word/2010/wordprocessingDrawing" xmlns:wp="http://schemas.openxmlformats.org/drawingml/2006/wordprocessingDrawing" xmlns:w10="urn:schemas-microsoft-com:office:word" xmlns:w="http://schemas.openxmlformats.org/wordprocessingml/2006/main" xmlns:w14="http://schemas.microsoft.com/office/word/2010/wordml" xmlns:w15="http://schemas.microsoft.com/office/word/2012/wordml" xmlns:w16cex="http://schemas.microsoft.com/office/word/2018/wordml/cex" xmlns:w16cid="http://schemas.microsoft.com/office/word/2016/wordml/cid" xmlns:w16="http://schemas.microsoft.com/office/word/2018/wordml" xmlns:w16sdtdh="http://schemas.microsoft.com/office/word/2020/wordml/sdtdatahash" xmlns:w16se="http://schemas.microsoft.com/office/word/2015/wordml/symex" xmlns:wpg="http://schemas.microsoft.com/office/word/2010/wordprocessingGroup" xmlns:wpi="http://schemas.microsoft.com/office/word/2010/wordprocessingInk" xmlns:wne="http://schemas.microsoft.com/office/word/2006/wordml" xmlns:wps="http://schemas.microsoft.com/office/word/2010/wordprocessingShape" mc:Ignorable="w14 w15 w16se w16cid w16 w16cex w16sdtdh wp14">
+<w:numbering xmlns:wpc="http://schemas.microsoft.com/office/word/2010/wordprocessingCanvas" xmlns:mc="http://schemas.openxmlformats.org/markup-compatibility/2006" xmlns:o="urn:schemas-microsoft-com:office:office" xmlns:r="http://schemas.openxmlformats.org/officeDocument/2006/relationships" xmlns:m="http://schemas.openxmlformats.org/officeDocument/2006/math" xmlns:v="urn:schemas-microsoft-com:vml" xmlns:wp14="http://schemas.microsoft.com/office/word/2010/wordprocessingDrawing" xmlns:wp="http://schemas.openxmlformats.org/drawingml/2006/wordprocessingDrawing" xmlns:w10="urn:schemas-microsoft-com:office:word" xmlns:w="http://schemas.openxmlformats.org/wordprocessingml/2006/main" xmlns:w14="http://schemas.microsoft.com/office/word/2010/wordml" xmlns:w15="http://schemas.microsoft.com/office/word/2012/wordml" xmlns:wpg="http://schemas.microsoft.com/office/word/2010/wordprocessingGroup" xmlns:wpi="http://schemas.microsoft.com/office/word/2010/wordprocessingInk" xmlns:wne="http://schemas.microsoft.com/office/word/2006/wordml" xmlns:wps="http://schemas.microsoft.com/office/word/2010/wordprocessingShape" mc:Ignorable="w14 w15 wp14">
   <w:abstractNum w:abstractNumId="0" w15:restartNumberingAfterBreak="0">
     <w:nsid w:val="CE960041"/>
     <w:multiLevelType w:val="singleLevel"/>
@@ -4539,7 +3375,7 @@
 </file>
 
 <file path=word/styles.xml><?xml version="1.0" encoding="utf-8"?>
-<w:styles xmlns:mc="http://schemas.openxmlformats.org/markup-compatibility/2006" xmlns:r="http://schemas.openxmlformats.org/officeDocument/2006/relationships" xmlns:w="http://schemas.openxmlformats.org/wordprocessingml/2006/main" xmlns:w14="http://schemas.microsoft.com/office/word/2010/wordml" xmlns:w15="http://schemas.microsoft.com/office/word/2012/wordml" xmlns:w16cex="http://schemas.microsoft.com/office/word/2018/wordml/cex" xmlns:w16cid="http://schemas.microsoft.com/office/word/2016/wordml/cid" xmlns:w16="http://schemas.microsoft.com/office/word/2018/wordml" xmlns:w16sdtdh="http://schemas.microsoft.com/office/word/2020/wordml/sdtdatahash" xmlns:w16se="http://schemas.microsoft.com/office/word/2015/wordml/symex" mc:Ignorable="w14 w15 w16se w16cid w16 w16cex w16sdtdh">
+<w:styles xmlns:mc="http://schemas.openxmlformats.org/markup-compatibility/2006" xmlns:r="http://schemas.openxmlformats.org/officeDocument/2006/relationships" xmlns:w="http://schemas.openxmlformats.org/wordprocessingml/2006/main" xmlns:w14="http://schemas.microsoft.com/office/word/2010/wordml" xmlns:w15="http://schemas.microsoft.com/office/word/2012/wordml" mc:Ignorable="w14 w15">
   <w:docDefaults>
     <w:rPrDefault>
       <w:rPr>
@@ -4549,7 +3385,7 @@
     </w:rPrDefault>
     <w:pPrDefault/>
   </w:docDefaults>
-  <w:latentStyles w:defLockedState="0" w:defUIPriority="0" w:defSemiHidden="0" w:defUnhideWhenUsed="0" w:defQFormat="0" w:count="376">
+  <w:latentStyles w:defLockedState="0" w:defUIPriority="0" w:defSemiHidden="0" w:defUnhideWhenUsed="0" w:defQFormat="0" w:count="371">
     <w:lsdException w:name="Normal" w:uiPriority="1" w:qFormat="1"/>
     <w:lsdException w:name="heading 1" w:qFormat="1"/>
     <w:lsdException w:name="heading 2" w:semiHidden="1" w:unhideWhenUsed="1" w:qFormat="1"/>
@@ -4571,7 +3407,7 @@
     <w:lsdException w:name="HTML Bottom of Form" w:semiHidden="1" w:uiPriority="99" w:unhideWhenUsed="1"/>
     <w:lsdException w:name="HTML Keyboard" w:semiHidden="1" w:unhideWhenUsed="1"/>
     <w:lsdException w:name="HTML Variable" w:semiHidden="1" w:unhideWhenUsed="1"/>
-    <w:lsdException w:name="Normal Table" w:qFormat="1"/>
+    <w:lsdException w:name="Normal Table" w:semiHidden="1" w:unhideWhenUsed="1" w:qFormat="1"/>
     <w:lsdException w:name="annotation subject" w:semiHidden="1" w:unhideWhenUsed="1"/>
     <w:lsdException w:name="No List" w:semiHidden="1" w:uiPriority="99" w:unhideWhenUsed="1"/>
     <w:lsdException w:name="Outline List 1" w:semiHidden="1" w:uiPriority="99" w:unhideWhenUsed="1"/>
@@ -4618,8 +3454,10 @@
     <w:lsdException w:name="Table Subtle 2" w:semiHidden="1" w:unhideWhenUsed="1"/>
     <w:lsdException w:name="Table Web 1" w:semiHidden="1" w:unhideWhenUsed="1"/>
     <w:lsdException w:name="Table Web 2" w:semiHidden="1" w:unhideWhenUsed="1"/>
+    <w:lsdException w:name="Table Web 3" w:semiHidden="1" w:unhideWhenUsed="1"/>
     <w:lsdException w:name="Balloon Text" w:semiHidden="1" w:unhideWhenUsed="1"/>
     <w:lsdException w:name="Table Grid" w:qFormat="1"/>
+    <w:lsdException w:name="Table Theme" w:semiHidden="1" w:unhideWhenUsed="1"/>
     <w:lsdException w:name="Placeholder Text" w:semiHidden="1" w:uiPriority="99"/>
     <w:lsdException w:name="No Spacing" w:uiPriority="99"/>
     <w:lsdException w:name="Light Shading" w:uiPriority="60"/>
@@ -4835,11 +3673,6 @@
     <w:lsdException w:name="List Table 5 Dark Accent 6" w:uiPriority="50"/>
     <w:lsdException w:name="List Table 6 Colorful Accent 6" w:uiPriority="51"/>
     <w:lsdException w:name="List Table 7 Colorful Accent 6" w:uiPriority="52"/>
-    <w:lsdException w:name="Mention" w:semiHidden="1" w:uiPriority="99" w:unhideWhenUsed="1"/>
-    <w:lsdException w:name="Smart Hyperlink" w:semiHidden="1" w:uiPriority="99" w:unhideWhenUsed="1"/>
-    <w:lsdException w:name="Hashtag" w:semiHidden="1" w:uiPriority="99" w:unhideWhenUsed="1"/>
-    <w:lsdException w:name="Unresolved Mention" w:semiHidden="1" w:uiPriority="99" w:unhideWhenUsed="1"/>
-    <w:lsdException w:name="Smart Link" w:semiHidden="1" w:uiPriority="99" w:unhideWhenUsed="1"/>
   </w:latentStyles>
   <w:style w:type="paragraph" w:default="1" w:styleId="Normal">
     <w:name w:val="Normal"/>

</xml_diff>

<commit_message>
feat: Selected Generated dan Penyesuaian Template
</commit_message>
<xml_diff>
--- a/templates/kgb-template.docx
+++ b/templates/kgb-template.docx
@@ -344,7 +344,7 @@
       <w:tblPr>
         <w:tblStyle w:val="TableGrid"/>
         <w:tblpPr w:leftFromText="180" w:rightFromText="180" w:vertAnchor="text" w:horzAnchor="margin" w:tblpXSpec="center" w:tblpY="207"/>
-        <w:tblW w:w="0" w:type="auto"/>
+        <w:tblW w:w="9815" w:type="dxa"/>
         <w:tblBorders>
           <w:top w:val="none" w:sz="0" w:space="0" w:color="auto"/>
           <w:left w:val="none" w:sz="0" w:space="0" w:color="auto"/>
@@ -353,11 +353,13 @@
           <w:insideH w:val="none" w:sz="0" w:space="0" w:color="auto"/>
           <w:insideV w:val="none" w:sz="0" w:space="0" w:color="auto"/>
         </w:tblBorders>
+        <w:tblLayout w:type="fixed"/>
         <w:tblLook w:val="04A0" w:firstRow="1" w:lastRow="0" w:firstColumn="1" w:lastColumn="0" w:noHBand="0" w:noVBand="1"/>
       </w:tblPr>
       <w:tblGrid>
-        <w:gridCol w:w="5812"/>
-        <w:gridCol w:w="3633"/>
+        <w:gridCol w:w="1795"/>
+        <w:gridCol w:w="4055"/>
+        <w:gridCol w:w="3965"/>
       </w:tblGrid>
       <w:tr>
         <w:trPr>
@@ -365,11 +367,16 @@
         </w:trPr>
         <w:tc>
           <w:tcPr>
-            <w:tcW w:w="5812" w:type="dxa"/>
+            <w:tcW w:w="5850" w:type="dxa"/>
+            <w:gridSpan w:val="2"/>
           </w:tcPr>
           <w:p>
             <w:pPr>
               <w:pStyle w:val="BodyText"/>
+              <w:spacing w:line="276" w:lineRule="auto"/>
+              <w:rPr>
+                <w:lang w:val="en-US"/>
+              </w:rPr>
             </w:pPr>
             <w:r>
               <w:t>Nomor</w:t>
@@ -381,19 +388,7 @@
               <w:rPr>
                 <w:lang w:val="en-US"/>
               </w:rPr>
-              <w:t xml:space="preserve">          </w:t>
-            </w:r>
-            <w:r>
-              <w:rPr>
-                <w:lang w:val="en-US"/>
-              </w:rPr>
-              <w:t xml:space="preserve"> </w:t>
-            </w:r>
-            <w:r>
-              <w:rPr>
-                <w:lang w:val="en-US"/>
-              </w:rPr>
-              <w:t xml:space="preserve"> </w:t>
+              <w:t xml:space="preserve">             </w:t>
             </w:r>
             <w:r>
               <w:t>:</w:t>
@@ -402,7 +397,7 @@
               <w:rPr>
                 <w:lang w:val="en-US"/>
               </w:rPr>
-              <w:t xml:space="preserve">  </w:t>
+              <w:t xml:space="preserve">    </w:t>
             </w:r>
             <w:r>
               <w:t>B</w:t>
@@ -414,7 +409,15 @@
               <w:t xml:space="preserve"> </w:t>
             </w:r>
             <w:r>
-              <w:t>–           /L.6.13/Cp.1/</w:t>
+              <w:t xml:space="preserve">–           </w:t>
+            </w:r>
+            <w:r>
+              <w:t xml:space="preserve">        </w:t>
+            </w:r>
+            <w:bookmarkStart w:id="0" w:name="_GoBack"/>
+            <w:bookmarkEnd w:id="0"/>
+            <w:r>
+              <w:t>/L.6.13/Cp.1/</w:t>
             </w:r>
             <w:r>
               <w:rPr>
@@ -435,12 +438,13 @@
         </w:tc>
         <w:tc>
           <w:tcPr>
-            <w:tcW w:w="3633" w:type="dxa"/>
+            <w:tcW w:w="3965" w:type="dxa"/>
           </w:tcPr>
           <w:p>
             <w:pPr>
               <w:pStyle w:val="BodyText"/>
               <w:spacing w:line="276" w:lineRule="auto"/>
+              <w:ind w:left="342"/>
               <w:rPr>
                 <w:lang w:val="en-US"/>
               </w:rPr>
@@ -449,7 +453,7 @@
               <w:rPr>
                 <w:lang w:val="en-US"/>
               </w:rPr>
-              <w:t>{tanggal_surat}</w:t>
+              <w:t>Baturaja, 15 September 2026</w:t>
             </w:r>
           </w:p>
         </w:tc>
@@ -460,20 +464,17 @@
         </w:trPr>
         <w:tc>
           <w:tcPr>
-            <w:tcW w:w="5812" w:type="dxa"/>
+            <w:tcW w:w="5850" w:type="dxa"/>
+            <w:gridSpan w:val="2"/>
           </w:tcPr>
           <w:p>
             <w:pPr>
               <w:pStyle w:val="BodyText"/>
-              <w:tabs>
-                <w:tab w:val="left" w:pos="720"/>
-                <w:tab w:val="left" w:pos="1440"/>
-                <w:tab w:val="left" w:pos="2160"/>
-                <w:tab w:val="left" w:pos="2880"/>
-                <w:tab w:val="left" w:pos="3600"/>
-                <w:tab w:val="left" w:pos="8820"/>
-              </w:tabs>
+              <w:jc w:val="left"/>
               <w:rPr>
+                <w:b/>
+                <w:bCs/>
+                <w:u w:val="single"/>
                 <w:lang w:val="en-US"/>
               </w:rPr>
             </w:pPr>
@@ -485,13 +486,13 @@
             </w:r>
             <w:r>
               <w:tab/>
-              <w:t>:</w:t>
+              <w:t xml:space="preserve"> :</w:t>
             </w:r>
             <w:r>
               <w:rPr>
                 <w:lang w:val="en-US"/>
               </w:rPr>
-              <w:t xml:space="preserve">  </w:t>
+              <w:t xml:space="preserve">    </w:t>
             </w:r>
             <w:r>
               <w:t>Biasa</w:t>
@@ -500,7 +501,7 @@
         </w:tc>
         <w:tc>
           <w:tcPr>
-            <w:tcW w:w="3633" w:type="dxa"/>
+            <w:tcW w:w="3965" w:type="dxa"/>
           </w:tcPr>
           <w:p>
             <w:pPr>
@@ -522,24 +523,29 @@
         </w:trPr>
         <w:tc>
           <w:tcPr>
-            <w:tcW w:w="5812" w:type="dxa"/>
+            <w:tcW w:w="5850" w:type="dxa"/>
+            <w:gridSpan w:val="2"/>
           </w:tcPr>
           <w:p>
             <w:pPr>
               <w:pStyle w:val="BodyText"/>
+              <w:spacing w:line="276" w:lineRule="auto"/>
+              <w:rPr>
+                <w:lang w:val="en-US"/>
+              </w:rPr>
             </w:pPr>
             <w:r>
               <w:t>Lampiran</w:t>
             </w:r>
             <w:r>
               <w:tab/>
-              <w:t>:</w:t>
+              <w:t xml:space="preserve"> :</w:t>
             </w:r>
             <w:r>
               <w:rPr>
                 <w:lang w:val="en-US"/>
               </w:rPr>
-              <w:t xml:space="preserve">  </w:t>
+              <w:t xml:space="preserve">    </w:t>
             </w:r>
             <w:r>
               <w:t xml:space="preserve">- </w:t>
@@ -548,12 +554,13 @@
         </w:tc>
         <w:tc>
           <w:tcPr>
-            <w:tcW w:w="3633" w:type="dxa"/>
+            <w:tcW w:w="3965" w:type="dxa"/>
           </w:tcPr>
           <w:p>
             <w:pPr>
               <w:pStyle w:val="BodyText"/>
               <w:spacing w:line="276" w:lineRule="auto"/>
+              <w:ind w:left="342"/>
               <w:jc w:val="left"/>
               <w:rPr>
                 <w:lang w:val="en-US"/>
@@ -574,7 +581,7 @@
         </w:trPr>
         <w:tc>
           <w:tcPr>
-            <w:tcW w:w="5812" w:type="dxa"/>
+            <w:tcW w:w="1795" w:type="dxa"/>
           </w:tcPr>
           <w:p>
             <w:pPr>
@@ -582,46 +589,63 @@
               <w:jc w:val="left"/>
             </w:pPr>
             <w:r>
-              <w:t>Perihal</w:t>
+              <w:t>Hal</w:t>
             </w:r>
             <w:r>
-              <w:rPr>
-                <w:lang w:val="en-US"/>
-              </w:rPr>
+              <w:tab/>
+              <w:t xml:space="preserve">            </w:t>
+            </w:r>
+            <w:r>
               <w:t xml:space="preserve"> </w:t>
             </w:r>
             <w:r>
-              <w:tab/>
               <w:t>:</w:t>
             </w:r>
             <w:r>
               <w:rPr>
                 <w:lang w:val="en-US"/>
               </w:rPr>
-              <w:t xml:space="preserve"> </w:t>
+              <w:t xml:space="preserve">  </w:t>
+            </w:r>
+          </w:p>
+        </w:tc>
+        <w:tc>
+          <w:tcPr>
+            <w:tcW w:w="4055" w:type="dxa"/>
+          </w:tcPr>
+          <w:p>
+            <w:pPr>
+              <w:pStyle w:val="BodyText"/>
+              <w:spacing w:line="276" w:lineRule="auto"/>
+              <w:rPr>
+                <w:b/>
+                <w:bCs/>
+                <w:lang w:val="en-US"/>
+              </w:rPr>
+            </w:pPr>
+            <w:r>
+              <w:rPr>
+                <w:lang w:val="en-US"/>
+              </w:rPr>
+              <w:t>Kenaikan Gaji Berkala a.</w:t>
             </w:r>
             <w:r>
               <w:rPr>
                 <w:lang w:val="en-US"/>
               </w:rPr>
-              <w:t xml:space="preserve"> </w:t>
-            </w:r>
-            <w:r>
-              <w:rPr>
-                <w:lang w:val="en-US"/>
-              </w:rPr>
-              <w:t>Kenaikan Gaji Berkala An.</w:t>
+              <w:t>n. {nama} {pangkat_golongan} NIP. {nip} pada Kejaksaan Negeri Ogan Komering Ulu.</w:t>
             </w:r>
           </w:p>
         </w:tc>
         <w:tc>
           <w:tcPr>
-            <w:tcW w:w="3633" w:type="dxa"/>
+            <w:tcW w:w="3965" w:type="dxa"/>
           </w:tcPr>
           <w:p>
             <w:pPr>
               <w:pStyle w:val="BodyText"/>
               <w:spacing w:line="276" w:lineRule="auto"/>
+              <w:ind w:left="342"/>
               <w:jc w:val="left"/>
               <w:rPr>
                 <w:b/>
@@ -638,53 +662,11 @@
               <w:t>KEPALA KANTOR PELAYANAN</w:t>
             </w:r>
           </w:p>
-        </w:tc>
-      </w:tr>
-      <w:tr>
-        <w:trPr>
-          <w:trHeight w:val="313"/>
-        </w:trPr>
-        <w:tc>
-          <w:tcPr>
-            <w:tcW w:w="5812" w:type="dxa"/>
-          </w:tcPr>
-          <w:p>
-            <w:pPr>
-              <w:pStyle w:val="BodyText"/>
-              <w:ind w:left="1591"/>
-              <w:jc w:val="left"/>
-              <w:rPr>
-                <w:lang w:val="en-US"/>
-              </w:rPr>
-            </w:pPr>
-            <w:r>
-              <w:rPr>
-                <w:lang w:val="en-US"/>
-              </w:rPr>
-              <w:t>{nama} {pangkat_golongan}</w:t>
-            </w:r>
-            <w:r>
-              <w:rPr>
-                <w:lang w:val="en-US"/>
-              </w:rPr>
-              <w:t xml:space="preserve"> NIP. {nip} pada Kejaksaan Negeri Ogan Komering Ulu</w:t>
-            </w:r>
-            <w:r>
-              <w:rPr>
-                <w:lang w:val="en-US"/>
-              </w:rPr>
-              <w:t>.</w:t>
-            </w:r>
-          </w:p>
-        </w:tc>
-        <w:tc>
-          <w:tcPr>
-            <w:tcW w:w="3633" w:type="dxa"/>
-          </w:tcPr>
           <w:p>
             <w:pPr>
               <w:pStyle w:val="BodyText"/>
               <w:spacing w:line="276" w:lineRule="auto"/>
+              <w:ind w:left="342"/>
               <w:jc w:val="left"/>
               <w:rPr>
                 <w:b/>
@@ -719,6 +701,7 @@
           </w:p>
           <w:p>
             <w:pPr>
+              <w:ind w:left="342"/>
               <w:rPr>
                 <w:b/>
                 <w:bCs/>
@@ -736,6 +719,7 @@
           </w:p>
           <w:p>
             <w:pPr>
+              <w:ind w:left="342"/>
               <w:rPr>
                 <w:b/>
                 <w:bCs/>
@@ -745,6 +729,7 @@
           </w:p>
           <w:p>
             <w:pPr>
+              <w:ind w:left="342"/>
               <w:jc w:val="center"/>
               <w:rPr>
                 <w:b/>
@@ -767,32 +752,6 @@
     </w:tbl>
     <w:p>
       <w:pPr>
-        <w:pStyle w:val="BodyText"/>
-        <w:tabs>
-          <w:tab w:val="left" w:pos="2255"/>
-          <w:tab w:val="left" w:pos="2534"/>
-        </w:tabs>
-        <w:spacing w:before="126"/>
-        <w:ind w:leftChars="7" w:left="15" w:rightChars="390" w:right="858" w:firstLineChars="492" w:firstLine="1230"/>
-        <w:rPr>
-          <w:sz w:val="25"/>
-        </w:rPr>
-      </w:pPr>
-    </w:p>
-    <w:p>
-      <w:pPr>
-        <w:spacing w:line="360" w:lineRule="auto"/>
-        <w:ind w:left="1100" w:rightChars="390" w:right="858" w:firstLine="73"/>
-        <w:jc w:val="both"/>
-        <w:rPr>
-          <w:rFonts w:ascii="Arial"/>
-          <w:bCs/>
-          <w:lang w:val="en-US"/>
-        </w:rPr>
-      </w:pPr>
-    </w:p>
-    <w:p>
-      <w:pPr>
         <w:tabs>
           <w:tab w:val="left" w:pos="1560"/>
         </w:tabs>
@@ -801,6 +760,17 @@
           <w:lang w:val="en-US"/>
         </w:rPr>
       </w:pPr>
+    </w:p>
+    <w:p>
+      <w:pPr>
+        <w:tabs>
+          <w:tab w:val="left" w:pos="1560"/>
+        </w:tabs>
+        <w:ind w:left="1560" w:right="80" w:firstLine="627"/>
+        <w:rPr>
+          <w:lang w:val="en-US"/>
+        </w:rPr>
+      </w:pPr>
       <w:r>
         <w:rPr>
           <w:lang w:val="en-US"/>
@@ -810,7 +780,7 @@
     </w:p>
     <w:p>
       <w:pPr>
-        <w:ind w:left="1560" w:right="80"/>
+        <w:ind w:left="2160" w:right="80"/>
         <w:rPr>
           <w:lang w:val="en-US"/>
         </w:rPr>
@@ -824,7 +794,7 @@
           <w:numId w:val="15"/>
         </w:numPr>
         <w:spacing w:line="360" w:lineRule="auto"/>
-        <w:ind w:left="1560" w:rightChars="390" w:right="858"/>
+        <w:ind w:left="2160" w:rightChars="390" w:right="858"/>
         <w:rPr>
           <w:lang w:val="en-US"/>
         </w:rPr>
@@ -875,7 +845,7 @@
           <w:numId w:val="15"/>
         </w:numPr>
         <w:spacing w:line="360" w:lineRule="auto"/>
-        <w:ind w:left="1560" w:rightChars="390" w:right="858"/>
+        <w:ind w:left="2160" w:rightChars="390" w:right="858"/>
         <w:rPr>
           <w:lang w:val="en-US"/>
         </w:rPr>
@@ -909,17 +879,6 @@
           <w:lang w:val="en-US"/>
         </w:rPr>
         <w:tab/>
-      </w:r>
-      <w:r>
-        <w:rPr>
-          <w:lang w:val="en-US"/>
-        </w:rPr>
-        <w:tab/>
-      </w:r>
-      <w:r>
-        <w:rPr>
-          <w:lang w:val="en-US"/>
-        </w:rPr>
         <w:t>:</w:t>
       </w:r>
       <w:r>
@@ -937,7 +896,7 @@
           <w:numId w:val="15"/>
         </w:numPr>
         <w:spacing w:line="360" w:lineRule="auto"/>
-        <w:ind w:left="1560" w:rightChars="390" w:right="858"/>
+        <w:ind w:left="2160" w:rightChars="390" w:right="858"/>
         <w:rPr>
           <w:lang w:val="en-US"/>
         </w:rPr>
@@ -959,17 +918,6 @@
           <w:lang w:val="en-US"/>
         </w:rPr>
         <w:tab/>
-      </w:r>
-      <w:r>
-        <w:rPr>
-          <w:lang w:val="en-US"/>
-        </w:rPr>
-        <w:tab/>
-      </w:r>
-      <w:r>
-        <w:rPr>
-          <w:lang w:val="en-US"/>
-        </w:rPr>
         <w:t>:</w:t>
       </w:r>
       <w:r>
@@ -987,7 +935,7 @@
           <w:numId w:val="15"/>
         </w:numPr>
         <w:spacing w:line="360" w:lineRule="auto"/>
-        <w:ind w:left="1560" w:rightChars="390" w:right="858"/>
+        <w:ind w:left="2160" w:rightChars="390" w:right="858"/>
         <w:rPr>
           <w:lang w:val="en-US"/>
         </w:rPr>
@@ -1026,7 +974,7 @@
           <w:numId w:val="15"/>
         </w:numPr>
         <w:spacing w:line="360" w:lineRule="auto"/>
-        <w:ind w:left="1560" w:rightChars="390" w:right="858"/>
+        <w:ind w:left="2160" w:rightChars="390" w:right="858"/>
         <w:rPr>
           <w:lang w:val="en-US"/>
         </w:rPr>
@@ -1053,7 +1001,6 @@
         <w:rPr>
           <w:lang w:val="en-US"/>
         </w:rPr>
-        <w:tab/>
         <w:t>:</w:t>
       </w:r>
       <w:r>
@@ -1065,15 +1012,15 @@
     </w:p>
     <w:p>
       <w:pPr>
-        <w:ind w:left="1560" w:right="80"/>
-        <w:rPr>
-          <w:lang w:val="en-US"/>
-        </w:rPr>
-      </w:pPr>
-    </w:p>
-    <w:p>
-      <w:pPr>
-        <w:ind w:left="1560" w:right="80"/>
+        <w:ind w:left="2160" w:right="80"/>
+        <w:rPr>
+          <w:lang w:val="en-US"/>
+        </w:rPr>
+      </w:pPr>
+    </w:p>
+    <w:p>
+      <w:pPr>
+        <w:ind w:left="2160" w:right="80"/>
         <w:rPr>
           <w:lang w:val="en-US"/>
         </w:rPr>
@@ -1087,7 +1034,7 @@
     </w:p>
     <w:p>
       <w:pPr>
-        <w:ind w:left="1560" w:right="80"/>
+        <w:ind w:left="2160" w:right="80"/>
         <w:rPr>
           <w:lang w:val="en-US"/>
         </w:rPr>
@@ -1101,7 +1048,7 @@
           <w:numId w:val="16"/>
         </w:numPr>
         <w:spacing w:line="360" w:lineRule="auto"/>
-        <w:ind w:left="1560" w:rightChars="390" w:right="858"/>
+        <w:ind w:left="2160" w:rightChars="390" w:right="858"/>
         <w:rPr>
           <w:lang w:val="en-US"/>
         </w:rPr>
@@ -1134,7 +1081,6 @@
         <w:rPr>
           <w:lang w:val="en-US"/>
         </w:rPr>
-        <w:tab/>
         <w:t>:</w:t>
       </w:r>
     </w:p>
@@ -1146,7 +1092,7 @@
           <w:numId w:val="16"/>
         </w:numPr>
         <w:spacing w:line="360" w:lineRule="auto"/>
-        <w:ind w:left="1560" w:rightChars="390" w:right="858"/>
+        <w:ind w:left="2160" w:rightChars="390" w:right="858"/>
         <w:rPr>
           <w:lang w:val="en-US"/>
         </w:rPr>
@@ -1179,46 +1125,6 @@
         <w:rPr>
           <w:lang w:val="en-US"/>
         </w:rPr>
-        <w:tab/>
-        <w:t>:</w:t>
-      </w:r>
-    </w:p>
-    <w:p>
-      <w:pPr>
-        <w:ind w:left="1440" w:right="80" w:firstLine="120"/>
-        <w:rPr>
-          <w:lang w:val="en-US"/>
-        </w:rPr>
-      </w:pPr>
-      <w:r>
-        <w:rPr>
-          <w:lang w:val="en-US"/>
-        </w:rPr>
-        <w:t>Nomor</w:t>
-      </w:r>
-      <w:r>
-        <w:rPr>
-          <w:lang w:val="en-US"/>
-        </w:rPr>
-        <w:tab/>
-      </w:r>
-      <w:r>
-        <w:rPr>
-          <w:lang w:val="en-US"/>
-        </w:rPr>
-        <w:tab/>
-      </w:r>
-      <w:r>
-        <w:rPr>
-          <w:lang w:val="en-US"/>
-        </w:rPr>
-        <w:tab/>
-      </w:r>
-      <w:r>
-        <w:rPr>
-          <w:lang w:val="en-US"/>
-        </w:rPr>
-        <w:tab/>
         <w:t>:</w:t>
       </w:r>
     </w:p>
@@ -1230,16 +1136,22 @@
           <w:numId w:val="16"/>
         </w:numPr>
         <w:spacing w:line="360" w:lineRule="auto"/>
-        <w:ind w:left="1560" w:rightChars="390" w:right="858"/>
-        <w:rPr>
-          <w:lang w:val="en-US"/>
-        </w:rPr>
-      </w:pPr>
-      <w:r>
-        <w:rPr>
-          <w:lang w:val="en-US"/>
-        </w:rPr>
-        <w:t>Tanggal Berlakunya</w:t>
+        <w:ind w:left="2160" w:rightChars="390" w:right="858"/>
+        <w:rPr>
+          <w:lang w:val="en-US"/>
+        </w:rPr>
+      </w:pPr>
+      <w:r>
+        <w:rPr>
+          <w:lang w:val="en-US"/>
+        </w:rPr>
+        <w:t>Nomor</w:t>
+      </w:r>
+      <w:r>
+        <w:rPr>
+          <w:lang w:val="en-US"/>
+        </w:rPr>
+        <w:tab/>
       </w:r>
       <w:r>
         <w:rPr>
@@ -1274,7 +1186,40 @@
           <w:numId w:val="16"/>
         </w:numPr>
         <w:spacing w:line="360" w:lineRule="auto"/>
-        <w:ind w:left="1560" w:rightChars="390" w:right="858"/>
+        <w:ind w:left="2160" w:rightChars="390" w:right="858"/>
+        <w:rPr>
+          <w:lang w:val="en-US"/>
+        </w:rPr>
+      </w:pPr>
+      <w:r>
+        <w:rPr>
+          <w:lang w:val="en-US"/>
+        </w:rPr>
+        <w:t>Tanggal Berlakunya</w:t>
+      </w:r>
+      <w:r>
+        <w:rPr>
+          <w:lang w:val="en-US"/>
+        </w:rPr>
+        <w:tab/>
+      </w:r>
+      <w:r>
+        <w:rPr>
+          <w:lang w:val="en-US"/>
+        </w:rPr>
+        <w:tab/>
+        <w:t>:</w:t>
+      </w:r>
+    </w:p>
+    <w:p>
+      <w:pPr>
+        <w:pStyle w:val="ListParagraph"/>
+        <w:numPr>
+          <w:ilvl w:val="0"/>
+          <w:numId w:val="16"/>
+        </w:numPr>
+        <w:spacing w:line="360" w:lineRule="auto"/>
+        <w:ind w:left="2160" w:rightChars="390" w:right="858"/>
         <w:rPr>
           <w:lang w:val="en-US"/>
         </w:rPr>
@@ -1302,17 +1247,6 @@
           <w:lang w:val="en-US"/>
         </w:rPr>
         <w:tab/>
-      </w:r>
-      <w:r>
-        <w:rPr>
-          <w:lang w:val="en-US"/>
-        </w:rPr>
-        <w:tab/>
-      </w:r>
-      <w:r>
-        <w:rPr>
-          <w:lang w:val="en-US"/>
-        </w:rPr>
         <w:t>:</w:t>
       </w:r>
       <w:r>
@@ -1336,15 +1270,15 @@
     </w:p>
     <w:p>
       <w:pPr>
-        <w:ind w:left="1560" w:right="80"/>
-        <w:rPr>
-          <w:lang w:val="en-US"/>
-        </w:rPr>
-      </w:pPr>
-    </w:p>
-    <w:p>
-      <w:pPr>
-        <w:ind w:left="1560" w:right="80"/>
+        <w:ind w:left="2160" w:right="80"/>
+        <w:rPr>
+          <w:lang w:val="en-US"/>
+        </w:rPr>
+      </w:pPr>
+    </w:p>
+    <w:p>
+      <w:pPr>
+        <w:ind w:left="2160" w:right="80"/>
         <w:rPr>
           <w:lang w:val="en-US"/>
         </w:rPr>
@@ -1358,7 +1292,7 @@
     </w:p>
     <w:p>
       <w:pPr>
-        <w:ind w:left="1560" w:right="80"/>
+        <w:ind w:left="2160" w:right="80"/>
         <w:rPr>
           <w:lang w:val="en-US"/>
         </w:rPr>
@@ -1372,7 +1306,7 @@
           <w:numId w:val="15"/>
         </w:numPr>
         <w:spacing w:line="360" w:lineRule="auto"/>
-        <w:ind w:left="1560" w:rightChars="390" w:right="858"/>
+        <w:ind w:left="2160" w:rightChars="390" w:right="858"/>
         <w:rPr>
           <w:lang w:val="en-US"/>
         </w:rPr>
@@ -1399,7 +1333,6 @@
         <w:rPr>
           <w:lang w:val="en-US"/>
         </w:rPr>
-        <w:tab/>
         <w:t>:</w:t>
       </w:r>
       <w:r>
@@ -1417,7 +1350,7 @@
           <w:numId w:val="15"/>
         </w:numPr>
         <w:spacing w:line="360" w:lineRule="auto"/>
-        <w:ind w:left="1560" w:rightChars="390" w:right="858"/>
+        <w:ind w:left="2160" w:rightChars="390" w:right="858"/>
         <w:rPr>
           <w:lang w:val="en-US"/>
         </w:rPr>
@@ -1438,7 +1371,6 @@
         <w:rPr>
           <w:lang w:val="en-US"/>
         </w:rPr>
-        <w:tab/>
         <w:t>:</w:t>
       </w:r>
       <w:r>
@@ -1453,8 +1385,6 @@
         </w:rPr>
         <w:t>_baru</w:t>
       </w:r>
-      <w:bookmarkStart w:id="0" w:name="_GoBack"/>
-      <w:bookmarkEnd w:id="0"/>
       <w:r>
         <w:rPr>
           <w:lang w:val="en-US"/>
@@ -1470,7 +1400,7 @@
           <w:numId w:val="15"/>
         </w:numPr>
         <w:spacing w:line="360" w:lineRule="auto"/>
-        <w:ind w:left="1560" w:rightChars="390" w:right="858"/>
+        <w:ind w:left="2160" w:rightChars="390" w:right="858"/>
         <w:rPr>
           <w:lang w:val="en-US"/>
         </w:rPr>
@@ -1497,7 +1427,6 @@
         <w:rPr>
           <w:lang w:val="en-US"/>
         </w:rPr>
-        <w:tab/>
         <w:t>:</w:t>
       </w:r>
       <w:r>
@@ -1515,7 +1444,7 @@
           <w:numId w:val="15"/>
         </w:numPr>
         <w:spacing w:line="360" w:lineRule="auto"/>
-        <w:ind w:left="1560" w:rightChars="390" w:right="858"/>
+        <w:ind w:left="2160" w:rightChars="390" w:right="858"/>
         <w:rPr>
           <w:lang w:val="en-US"/>
         </w:rPr>
@@ -1560,7 +1489,7 @@
           <w:numId w:val="15"/>
         </w:numPr>
         <w:spacing w:line="360" w:lineRule="auto"/>
-        <w:ind w:left="1560" w:rightChars="390" w:right="858"/>
+        <w:ind w:left="2160" w:rightChars="390" w:right="858"/>
         <w:rPr>
           <w:lang w:val="en-US"/>
         </w:rPr>
@@ -1581,7 +1510,6 @@
         <w:rPr>
           <w:lang w:val="en-US"/>
         </w:rPr>
-        <w:tab/>
         <w:t>:</w:t>
       </w:r>
       <w:r>
@@ -1613,17 +1541,21 @@
         <w:rPr>
           <w:lang w:val="en-US"/>
         </w:rPr>
+        <w:tab/>
+      </w:r>
+      <w:r>
+        <w:rPr>
+          <w:lang w:val="en-US"/>
+        </w:rPr>
         <w:t>Diharapkan sesuai dengan Peraturan Pemerintah Nomor 5 Tahun 2024 tanggal 26 Januari 2024 Kepada Pegawai Negeri Sipil tersebut agar dapat dibayarkan penghasilannya berdasarkan gajinya yang baru.</w:t>
       </w:r>
     </w:p>
     <w:p>
       <w:pPr>
-        <w:spacing w:line="360" w:lineRule="auto"/>
-        <w:ind w:left="1100" w:rightChars="390" w:right="858" w:firstLine="73"/>
-        <w:rPr>
-          <w:rFonts w:ascii="Arial"/>
-          <w:b/>
-          <w:lang w:val="en-US"/>
+        <w:pStyle w:val="BodyText"/>
+        <w:ind w:firstLine="66"/>
+        <w:rPr>
+          <w:sz w:val="20"/>
         </w:rPr>
       </w:pPr>
     </w:p>
@@ -1923,12 +1855,10 @@
     </w:p>
     <w:p>
       <w:pPr>
-        <w:pStyle w:val="BodyText"/>
-        <w:spacing w:before="3"/>
-        <w:rPr>
-          <w:rFonts w:ascii="Arial"/>
-          <w:b/>
-          <w:sz w:val="33"/>
+        <w:spacing w:before="1"/>
+        <w:ind w:left="1100" w:firstLine="66"/>
+        <w:rPr>
+          <w:sz w:val="20"/>
         </w:rPr>
       </w:pPr>
     </w:p>
@@ -2435,6 +2365,32 @@
         </w:rPr>
         <w:t>;</w:t>
       </w:r>
+    </w:p>
+    <w:p>
+      <w:pPr>
+        <w:tabs>
+          <w:tab w:val="left" w:pos="1543"/>
+          <w:tab w:val="left" w:pos="1544"/>
+          <w:tab w:val="left" w:pos="1701"/>
+        </w:tabs>
+        <w:rPr>
+          <w:sz w:val="18"/>
+          <w:szCs w:val="18"/>
+        </w:rPr>
+      </w:pPr>
+    </w:p>
+    <w:p>
+      <w:pPr>
+        <w:tabs>
+          <w:tab w:val="left" w:pos="1543"/>
+          <w:tab w:val="left" w:pos="1544"/>
+          <w:tab w:val="left" w:pos="1701"/>
+        </w:tabs>
+        <w:rPr>
+          <w:sz w:val="18"/>
+          <w:szCs w:val="18"/>
+        </w:rPr>
+      </w:pPr>
     </w:p>
     <w:sectPr>
       <w:headerReference w:type="default" r:id="rId10"/>

</xml_diff>

<commit_message>
feat: add Electron main process with SQLite database, Excel parsing, and document generation
</commit_message>
<xml_diff>
--- a/templates/kgb-template.docx
+++ b/templates/kgb-template.docx
@@ -329,7 +329,7 @@
               </wp:anchor>
             </w:drawing>
           </mc:Choice>
-          <mc:Fallback xmlns:w16se="http://schemas.microsoft.com/office/word/2015/wordml/symex" xmlns:w16sdtdh="http://schemas.microsoft.com/office/word/2020/wordml/sdtdatahash" xmlns:w16="http://schemas.microsoft.com/office/word/2018/wordml" xmlns:w16cid="http://schemas.microsoft.com/office/word/2016/wordml/cid" xmlns:w16cex="http://schemas.microsoft.com/office/word/2018/wordml/cex" xmlns:am3d="http://schemas.microsoft.com/office/drawing/2017/model3d" xmlns:aink="http://schemas.microsoft.com/office/drawing/2016/ink" xmlns:cx8="http://schemas.microsoft.com/office/drawing/2016/5/14/chartex" xmlns:cx7="http://schemas.microsoft.com/office/drawing/2016/5/13/chartex" xmlns:cx6="http://schemas.microsoft.com/office/drawing/2016/5/12/chartex" xmlns:cx5="http://schemas.microsoft.com/office/drawing/2016/5/11/chartex" xmlns:cx4="http://schemas.microsoft.com/office/drawing/2016/5/10/chartex" xmlns:cx3="http://schemas.microsoft.com/office/drawing/2016/5/9/chartex" xmlns:cx2="http://schemas.microsoft.com/office/drawing/2015/10/21/chartex" xmlns:cx1="http://schemas.microsoft.com/office/drawing/2015/9/8/chartex" xmlns:cx="http://schemas.microsoft.com/office/drawing/2014/chartex">
+          <mc:Fallback xmlns:cx="http://schemas.microsoft.com/office/drawing/2014/chartex" xmlns:cx1="http://schemas.microsoft.com/office/drawing/2015/9/8/chartex" xmlns:cx2="http://schemas.microsoft.com/office/drawing/2015/10/21/chartex" xmlns:cx3="http://schemas.microsoft.com/office/drawing/2016/5/9/chartex" xmlns:cx4="http://schemas.microsoft.com/office/drawing/2016/5/10/chartex" xmlns:cx5="http://schemas.microsoft.com/office/drawing/2016/5/11/chartex" xmlns:cx6="http://schemas.microsoft.com/office/drawing/2016/5/12/chartex" xmlns:cx7="http://schemas.microsoft.com/office/drawing/2016/5/13/chartex" xmlns:cx8="http://schemas.microsoft.com/office/drawing/2016/5/14/chartex" xmlns:aink="http://schemas.microsoft.com/office/drawing/2016/ink" xmlns:am3d="http://schemas.microsoft.com/office/drawing/2017/model3d" xmlns:w16cex="http://schemas.microsoft.com/office/word/2018/wordml/cex" xmlns:w16cid="http://schemas.microsoft.com/office/word/2016/wordml/cid" xmlns:w16="http://schemas.microsoft.com/office/word/2018/wordml" xmlns:w16sdtdh="http://schemas.microsoft.com/office/word/2020/wordml/sdtdatahash" xmlns:w16se="http://schemas.microsoft.com/office/word/2015/wordml/symex">
             <w:pict>
               <v:line w14:anchorId="0ACB3A0F" id="Straight Connector 47" o:spid="_x0000_s1026" style="position:absolute;z-index:251752448;visibility:visible;mso-wrap-style:square;mso-width-percent:0;mso-height-percent:0;mso-wrap-distance-left:9pt;mso-wrap-distance-top:-3e-5mm;mso-wrap-distance-right:9pt;mso-wrap-distance-bottom:-3e-5mm;mso-position-horizontal:absolute;mso-position-horizontal-relative:text;mso-position-vertical:absolute;mso-position-vertical-relative:text;mso-width-percent:0;mso-height-percent:0;mso-width-relative:margin;mso-height-relative:page" from="45.05pt,1.65pt" to="547.65pt,1.65pt" o:gfxdata="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" strokecolor="windowText" strokeweight="3.75pt">
                 <v:stroke linestyle="thinThick" joinstyle="miter"/>
@@ -397,7 +397,7 @@
               <w:rPr>
                 <w:lang w:val="en-US"/>
               </w:rPr>
-              <w:t xml:space="preserve">    </w:t>
+              <w:t xml:space="preserve">   </w:t>
             </w:r>
             <w:r>
               <w:t>B</w:t>
@@ -414,8 +414,6 @@
             <w:r>
               <w:t xml:space="preserve">        </w:t>
             </w:r>
-            <w:bookmarkStart w:id="0" w:name="_GoBack"/>
-            <w:bookmarkEnd w:id="0"/>
             <w:r>
               <w:t>/L.6.13/Cp.1/</w:t>
             </w:r>
@@ -423,16 +421,19 @@
               <w:rPr>
                 <w:lang w:val="en-US"/>
               </w:rPr>
-              <w:t>09</w:t>
-            </w:r>
-            <w:r>
-              <w:t>/202</w:t>
+              <w:t>{</w:t>
             </w:r>
             <w:r>
               <w:rPr>
                 <w:lang w:val="en-US"/>
               </w:rPr>
-              <w:t xml:space="preserve">6                </w:t>
+              <w:t>bln_thn</w:t>
+            </w:r>
+            <w:r>
+              <w:rPr>
+                <w:lang w:val="en-US"/>
+              </w:rPr>
+              <w:t>}</w:t>
             </w:r>
           </w:p>
         </w:tc>
@@ -453,7 +454,7 @@
               <w:rPr>
                 <w:lang w:val="en-US"/>
               </w:rPr>
-              <w:t>Baturaja, 15 September 2026</w:t>
+              <w:t>{tanggal_surat}</w:t>
             </w:r>
           </w:p>
         </w:tc>
@@ -834,8 +835,17 @@
         <w:rPr>
           <w:lang w:val="en-US"/>
         </w:rPr>
-        <w:t xml:space="preserve">  {nama}</w:t>
-      </w:r>
+        <w:t xml:space="preserve">  </w:t>
+      </w:r>
+      <w:bookmarkStart w:id="0" w:name="_GoBack"/>
+      <w:r>
+        <w:rPr>
+          <w:b/>
+          <w:lang w:val="en-US"/>
+        </w:rPr>
+        <w:t>{nama}</w:t>
+      </w:r>
+      <w:bookmarkEnd w:id="0"/>
     </w:p>
     <w:p>
       <w:pPr>
@@ -1131,12 +1141,8 @@
     <w:p>
       <w:pPr>
         <w:pStyle w:val="ListParagraph"/>
-        <w:numPr>
-          <w:ilvl w:val="0"/>
-          <w:numId w:val="16"/>
-        </w:numPr>
         <w:spacing w:line="360" w:lineRule="auto"/>
-        <w:ind w:left="2160" w:rightChars="390" w:right="858"/>
+        <w:ind w:left="2160" w:rightChars="390" w:right="858" w:firstLine="0"/>
         <w:rPr>
           <w:lang w:val="en-US"/>
         </w:rPr>

</xml_diff>